<commit_message>
Hibernate with jsp and servlet (MVC)
</commit_message>
<xml_diff>
--- a/LAB EXERCISES/Hibernate Program Architecture -15-4-2026.docx
+++ b/LAB EXERCISES/Hibernate Program Architecture -15-4-2026.docx
@@ -1837,8 +1837,6 @@
       <w:r>
         <w:t xml:space="preserve">                              9</w:t>
       </w:r>
-      <w:bookmarkStart w:id="0" w:name="_GoBack"/>
-      <w:bookmarkEnd w:id="0"/>
       <w:r>
         <w:t xml:space="preserve">. </w:t>
       </w:r>
@@ -8426,89 +8424,85 @@
     <w:p>
       <w:pPr>
         <w:rPr>
-          <w:b/>
-          <w:sz w:val="28"/>
-          <w:szCs w:val="28"/>
-        </w:rPr>
-      </w:pPr>
-      <w:r>
-        <w:rPr>
-          <w:b/>
-          <w:sz w:val="28"/>
-          <w:szCs w:val="28"/>
-        </w:rPr>
-        <w:t xml:space="preserve">Create two packages under </w:t>
+          <w:sz w:val="28"/>
+          <w:szCs w:val="28"/>
+        </w:rPr>
+      </w:pPr>
+      <w:r>
+        <w:rPr>
+          <w:sz w:val="28"/>
+          <w:szCs w:val="28"/>
+        </w:rPr>
+        <w:t xml:space="preserve">All Servlets must be created inside </w:t>
+      </w:r>
+      <w:proofErr w:type="gramStart"/>
+      <w:r>
+        <w:rPr>
+          <w:sz w:val="28"/>
+          <w:szCs w:val="28"/>
+        </w:rPr>
+        <w:t>classes</w:t>
+      </w:r>
+      <w:proofErr w:type="gramEnd"/>
+      <w:r>
+        <w:rPr>
+          <w:sz w:val="28"/>
+          <w:szCs w:val="28"/>
+        </w:rPr>
+        <w:t xml:space="preserve"> folder inside </w:t>
       </w:r>
       <w:proofErr w:type="spellStart"/>
       <w:r>
         <w:rPr>
-          <w:b/>
-          <w:sz w:val="28"/>
-          <w:szCs w:val="28"/>
-        </w:rPr>
-        <w:t>src</w:t>
+          <w:sz w:val="28"/>
+          <w:szCs w:val="28"/>
+        </w:rPr>
+        <w:t>webapp</w:t>
       </w:r>
       <w:proofErr w:type="spellEnd"/>
       <w:r>
         <w:rPr>
-          <w:b/>
-          <w:sz w:val="28"/>
-          <w:szCs w:val="28"/>
-        </w:rPr>
-        <w:t>/main/java</w:t>
-      </w:r>
-    </w:p>
-    <w:p>
-      <w:pPr>
-        <w:rPr>
-          <w:b/>
-          <w:sz w:val="28"/>
-          <w:szCs w:val="28"/>
-        </w:rPr>
-      </w:pPr>
-      <w:r>
-        <w:rPr>
-          <w:b/>
-          <w:sz w:val="28"/>
-          <w:szCs w:val="28"/>
-        </w:rPr>
-        <w:t xml:space="preserve"> Name them Model and Repository</w:t>
-      </w:r>
-    </w:p>
-    <w:p>
-      <w:pPr>
-        <w:rPr>
-          <w:b/>
-          <w:sz w:val="28"/>
-          <w:szCs w:val="28"/>
-        </w:rPr>
-      </w:pPr>
-      <w:r>
-        <w:rPr>
-          <w:b/>
-          <w:sz w:val="28"/>
-          <w:szCs w:val="28"/>
-        </w:rPr>
-        <w:t xml:space="preserve">All </w:t>
+          <w:sz w:val="28"/>
+          <w:szCs w:val="28"/>
+        </w:rPr>
+        <w:t>/WEB-INF</w:t>
+      </w:r>
+    </w:p>
+    <w:p>
+      <w:pPr>
+        <w:rPr>
+          <w:sz w:val="28"/>
+          <w:szCs w:val="28"/>
+        </w:rPr>
+      </w:pPr>
+      <w:r>
+        <w:rPr>
+          <w:sz w:val="28"/>
+          <w:szCs w:val="28"/>
+        </w:rPr>
+        <w:t>Right click, Create folder classes, select classes folder -&gt; right click-&gt; servlet</w:t>
+      </w:r>
+    </w:p>
+    <w:p>
+      <w:pPr>
+        <w:pStyle w:val="NoSpacing"/>
+      </w:pPr>
+      <w:r>
+        <w:t xml:space="preserve">Give name Register, Select </w:t>
       </w:r>
       <w:proofErr w:type="spellStart"/>
       <w:r>
-        <w:rPr>
-          <w:b/>
-          <w:sz w:val="28"/>
-          <w:szCs w:val="28"/>
-        </w:rPr>
-        <w:t>pojo</w:t>
+        <w:t>doPost</w:t>
       </w:r>
       <w:proofErr w:type="spellEnd"/>
-      <w:r>
-        <w:rPr>
-          <w:b/>
-          <w:sz w:val="28"/>
-          <w:szCs w:val="28"/>
-        </w:rPr>
-        <w:t xml:space="preserve"> must be created under Model package</w:t>
-      </w:r>
+    </w:p>
+    <w:p>
+      <w:pPr>
+        <w:rPr>
+          <w:sz w:val="28"/>
+          <w:szCs w:val="28"/>
+        </w:rPr>
+      </w:pPr>
     </w:p>
     <w:p>
       <w:pPr>
@@ -8516,11 +8510,19 @@
       </w:pPr>
       <w:proofErr w:type="gramStart"/>
       <w:r>
-        <w:t>package</w:t>
+        <w:t>import</w:t>
       </w:r>
       <w:proofErr w:type="gramEnd"/>
       <w:r>
-        <w:t xml:space="preserve"> Model;</w:t>
+        <w:t xml:space="preserve"> </w:t>
+      </w:r>
+      <w:proofErr w:type="spellStart"/>
+      <w:r>
+        <w:t>java.io.IOException</w:t>
+      </w:r>
+      <w:proofErr w:type="spellEnd"/>
+      <w:r>
+        <w:t>;</w:t>
       </w:r>
     </w:p>
     <w:p>
@@ -8537,7 +8539,7 @@
       </w:r>
       <w:proofErr w:type="spellStart"/>
       <w:r>
-        <w:t>java.io.Serializable</w:t>
+        <w:t>javax.servlet.ServletException</w:t>
       </w:r>
       <w:proofErr w:type="spellEnd"/>
       <w:r>
@@ -8548,11 +8550,6 @@
       <w:pPr>
         <w:pStyle w:val="NoSpacing"/>
       </w:pPr>
-    </w:p>
-    <w:p>
-      <w:pPr>
-        <w:pStyle w:val="NoSpacing"/>
-      </w:pPr>
       <w:proofErr w:type="gramStart"/>
       <w:r>
         <w:t>import</w:t>
@@ -8563,7 +8560,7 @@
       </w:r>
       <w:proofErr w:type="spellStart"/>
       <w:r>
-        <w:t>javax.persistence.Column</w:t>
+        <w:t>javax.servlet.http.HttpServlet</w:t>
       </w:r>
       <w:proofErr w:type="spellEnd"/>
       <w:r>
@@ -8584,7 +8581,7 @@
       </w:r>
       <w:proofErr w:type="spellStart"/>
       <w:r>
-        <w:t>javax.persistence.Entity</w:t>
+        <w:t>javax.servlet.http.HttpServletRequest</w:t>
       </w:r>
       <w:proofErr w:type="spellEnd"/>
       <w:r>
@@ -8605,7 +8602,7 @@
       </w:r>
       <w:proofErr w:type="spellStart"/>
       <w:r>
-        <w:t>javax.persistence.GeneratedValue</w:t>
+        <w:t>javax.servlet.http.HttpServletResponse</w:t>
       </w:r>
       <w:proofErr w:type="spellEnd"/>
       <w:r>
@@ -8616,6 +8613,11 @@
       <w:pPr>
         <w:pStyle w:val="NoSpacing"/>
       </w:pPr>
+    </w:p>
+    <w:p>
+      <w:pPr>
+        <w:pStyle w:val="NoSpacing"/>
+      </w:pPr>
       <w:proofErr w:type="gramStart"/>
       <w:r>
         <w:t>import</w:t>
@@ -8626,7 +8628,7 @@
       </w:r>
       <w:proofErr w:type="spellStart"/>
       <w:r>
-        <w:t>javax.persistence.GenerationType</w:t>
+        <w:t>Model.User</w:t>
       </w:r>
       <w:proofErr w:type="spellEnd"/>
       <w:r>
@@ -8647,7 +8649,7 @@
       </w:r>
       <w:proofErr w:type="spellStart"/>
       <w:r>
-        <w:t>javax.persistence.Id</w:t>
+        <w:t>Repository.UserDAO</w:t>
       </w:r>
       <w:proofErr w:type="spellEnd"/>
       <w:r>
@@ -8658,26 +8660,21 @@
       <w:pPr>
         <w:pStyle w:val="NoSpacing"/>
       </w:pPr>
-    </w:p>
-    <w:p>
-      <w:pPr>
-        <w:pStyle w:val="NoSpacing"/>
-      </w:pPr>
-      <w:r>
-        <w:t>@Entity</w:t>
-      </w:r>
-    </w:p>
-    <w:p>
-      <w:pPr>
-        <w:pStyle w:val="NoSpacing"/>
-      </w:pPr>
       <w:proofErr w:type="gramStart"/>
       <w:r>
         <w:t>public</w:t>
       </w:r>
       <w:proofErr w:type="gramEnd"/>
       <w:r>
-        <w:t xml:space="preserve"> class User implements Serializable {</w:t>
+        <w:t xml:space="preserve"> class Register extends </w:t>
+      </w:r>
+      <w:proofErr w:type="spellStart"/>
+      <w:r>
+        <w:t>HttpServlet</w:t>
+      </w:r>
+      <w:proofErr w:type="spellEnd"/>
+      <w:r>
+        <w:t xml:space="preserve"> {</w:t>
       </w:r>
     </w:p>
     <w:p>
@@ -8693,632 +8690,83 @@
         <w:pStyle w:val="NoSpacing"/>
       </w:pPr>
       <w:r>
-        <w:t xml:space="preserve">    @Id</w:t>
-      </w:r>
-    </w:p>
-    <w:p>
-      <w:pPr>
-        <w:pStyle w:val="NoSpacing"/>
-      </w:pPr>
-      <w:r>
         <w:t xml:space="preserve">    </w:t>
       </w:r>
+    </w:p>
+    <w:p>
+      <w:pPr>
+        <w:pStyle w:val="NoSpacing"/>
+      </w:pPr>
+      <w:r>
+        <w:tab/>
+      </w:r>
       <w:proofErr w:type="gramStart"/>
       <w:r>
-        <w:t>@</w:t>
+        <w:t>protected</w:t>
+      </w:r>
+      <w:proofErr w:type="gramEnd"/>
+      <w:r>
+        <w:t xml:space="preserve"> void </w:t>
       </w:r>
       <w:proofErr w:type="spellStart"/>
       <w:r>
-        <w:t>GeneratedValue</w:t>
+        <w:t>doPost</w:t>
       </w:r>
       <w:proofErr w:type="spellEnd"/>
       <w:r>
         <w:t>(</w:t>
       </w:r>
+      <w:proofErr w:type="spellStart"/>
+      <w:r>
+        <w:t>HttpServletRequest</w:t>
+      </w:r>
+      <w:proofErr w:type="spellEnd"/>
+      <w:r>
+        <w:t xml:space="preserve"> request, </w:t>
+      </w:r>
+      <w:proofErr w:type="spellStart"/>
+      <w:r>
+        <w:t>HttpServletResponse</w:t>
+      </w:r>
+      <w:proofErr w:type="spellEnd"/>
+      <w:r>
+        <w:t xml:space="preserve"> response) throws </w:t>
+      </w:r>
+      <w:proofErr w:type="spellStart"/>
+      <w:r>
+        <w:t>ServletException</w:t>
+      </w:r>
+      <w:proofErr w:type="spellEnd"/>
+      <w:r>
+        <w:t xml:space="preserve">, </w:t>
+      </w:r>
+      <w:proofErr w:type="spellStart"/>
+      <w:r>
+        <w:t>IOException</w:t>
+      </w:r>
+      <w:proofErr w:type="spellEnd"/>
+      <w:r>
+        <w:t xml:space="preserve"> {</w:t>
+      </w:r>
+    </w:p>
+    <w:p>
+      <w:pPr>
+        <w:pStyle w:val="NoSpacing"/>
+      </w:pPr>
+      <w:r>
+        <w:tab/>
+      </w:r>
+      <w:r>
+        <w:tab/>
+        <w:t xml:space="preserve">User user=new </w:t>
+      </w:r>
+      <w:proofErr w:type="gramStart"/>
+      <w:r>
+        <w:t>User(</w:t>
+      </w:r>
       <w:proofErr w:type="gramEnd"/>
       <w:r>
-        <w:t xml:space="preserve">strategy = </w:t>
-      </w:r>
-      <w:proofErr w:type="spellStart"/>
-      <w:r>
-        <w:t>GenerationType.AUTO</w:t>
-      </w:r>
-      <w:proofErr w:type="spellEnd"/>
-      <w:r>
-        <w:t>)</w:t>
-      </w:r>
-    </w:p>
-    <w:p>
-      <w:pPr>
-        <w:pStyle w:val="NoSpacing"/>
-      </w:pPr>
-      <w:r>
-        <w:t xml:space="preserve">    </w:t>
-      </w:r>
-      <w:proofErr w:type="gramStart"/>
-      <w:r>
-        <w:t>private</w:t>
-      </w:r>
-      <w:proofErr w:type="gramEnd"/>
-      <w:r>
-        <w:t xml:space="preserve"> </w:t>
-      </w:r>
-      <w:proofErr w:type="spellStart"/>
-      <w:r>
-        <w:t>int</w:t>
-      </w:r>
-      <w:proofErr w:type="spellEnd"/>
-      <w:r>
-        <w:t xml:space="preserve"> id;</w:t>
-      </w:r>
-    </w:p>
-    <w:p>
-      <w:pPr>
-        <w:pStyle w:val="NoSpacing"/>
-      </w:pPr>
-    </w:p>
-    <w:p>
-      <w:pPr>
-        <w:pStyle w:val="NoSpacing"/>
-      </w:pPr>
-      <w:r>
-        <w:t xml:space="preserve">    @Column</w:t>
-      </w:r>
-    </w:p>
-    <w:p>
-      <w:pPr>
-        <w:pStyle w:val="NoSpacing"/>
-      </w:pPr>
-      <w:r>
-        <w:t xml:space="preserve">    </w:t>
-      </w:r>
-      <w:proofErr w:type="gramStart"/>
-      <w:r>
-        <w:t>private</w:t>
-      </w:r>
-      <w:proofErr w:type="gramEnd"/>
-      <w:r>
-        <w:t xml:space="preserve"> String </w:t>
-      </w:r>
-      <w:proofErr w:type="spellStart"/>
-      <w:r>
-        <w:t>firstName</w:t>
-      </w:r>
-      <w:proofErr w:type="spellEnd"/>
-      <w:r>
-        <w:t>;</w:t>
-      </w:r>
-    </w:p>
-    <w:p>
-      <w:pPr>
-        <w:pStyle w:val="NoSpacing"/>
-      </w:pPr>
-    </w:p>
-    <w:p>
-      <w:pPr>
-        <w:pStyle w:val="NoSpacing"/>
-      </w:pPr>
-      <w:r>
-        <w:t xml:space="preserve">    @Column</w:t>
-      </w:r>
-    </w:p>
-    <w:p>
-      <w:pPr>
-        <w:pStyle w:val="NoSpacing"/>
-      </w:pPr>
-      <w:r>
-        <w:t xml:space="preserve">    </w:t>
-      </w:r>
-      <w:proofErr w:type="gramStart"/>
-      <w:r>
-        <w:t>private</w:t>
-      </w:r>
-      <w:proofErr w:type="gramEnd"/>
-      <w:r>
-        <w:t xml:space="preserve"> String </w:t>
-      </w:r>
-      <w:proofErr w:type="spellStart"/>
-      <w:r>
-        <w:t>lastName</w:t>
-      </w:r>
-      <w:proofErr w:type="spellEnd"/>
-      <w:r>
-        <w:t>;</w:t>
-      </w:r>
-    </w:p>
-    <w:p>
-      <w:pPr>
-        <w:pStyle w:val="NoSpacing"/>
-      </w:pPr>
-    </w:p>
-    <w:p>
-      <w:pPr>
-        <w:pStyle w:val="NoSpacing"/>
-      </w:pPr>
-      <w:r>
-        <w:t xml:space="preserve">    @Column</w:t>
-      </w:r>
-    </w:p>
-    <w:p>
-      <w:pPr>
-        <w:pStyle w:val="NoSpacing"/>
-      </w:pPr>
-      <w:r>
-        <w:t xml:space="preserve">    </w:t>
-      </w:r>
-      <w:proofErr w:type="gramStart"/>
-      <w:r>
-        <w:t>private</w:t>
-      </w:r>
-      <w:proofErr w:type="gramEnd"/>
-      <w:r>
-        <w:t xml:space="preserve"> String username;</w:t>
-      </w:r>
-    </w:p>
-    <w:p>
-      <w:pPr>
-        <w:pStyle w:val="NoSpacing"/>
-      </w:pPr>
-    </w:p>
-    <w:p>
-      <w:pPr>
-        <w:pStyle w:val="NoSpacing"/>
-      </w:pPr>
-      <w:r>
-        <w:t xml:space="preserve">    @Column</w:t>
-      </w:r>
-    </w:p>
-    <w:p>
-      <w:pPr>
-        <w:pStyle w:val="NoSpacing"/>
-      </w:pPr>
-      <w:r>
-        <w:t xml:space="preserve">    </w:t>
-      </w:r>
-      <w:proofErr w:type="gramStart"/>
-      <w:r>
-        <w:t>private</w:t>
-      </w:r>
-      <w:proofErr w:type="gramEnd"/>
-      <w:r>
-        <w:t xml:space="preserve"> String password;</w:t>
-      </w:r>
-    </w:p>
-    <w:p>
-      <w:pPr>
-        <w:pStyle w:val="NoSpacing"/>
-      </w:pPr>
-    </w:p>
-    <w:p>
-      <w:pPr>
-        <w:pStyle w:val="NoSpacing"/>
-      </w:pPr>
-      <w:r>
-        <w:t xml:space="preserve">    </w:t>
-      </w:r>
-      <w:proofErr w:type="gramStart"/>
-      <w:r>
-        <w:t>public</w:t>
-      </w:r>
-      <w:proofErr w:type="gramEnd"/>
-      <w:r>
-        <w:t xml:space="preserve"> String </w:t>
-      </w:r>
-      <w:proofErr w:type="spellStart"/>
-      <w:r>
-        <w:t>getFirstName</w:t>
-      </w:r>
-      <w:proofErr w:type="spellEnd"/>
-      <w:r>
-        <w:t>() {</w:t>
-      </w:r>
-    </w:p>
-    <w:p>
-      <w:pPr>
-        <w:pStyle w:val="NoSpacing"/>
-      </w:pPr>
-      <w:r>
-        <w:t xml:space="preserve">        </w:t>
-      </w:r>
-      <w:proofErr w:type="gramStart"/>
-      <w:r>
-        <w:t>return</w:t>
-      </w:r>
-      <w:proofErr w:type="gramEnd"/>
-      <w:r>
-        <w:t xml:space="preserve"> </w:t>
-      </w:r>
-      <w:proofErr w:type="spellStart"/>
-      <w:r>
-        <w:t>firstName</w:t>
-      </w:r>
-      <w:proofErr w:type="spellEnd"/>
-      <w:r>
-        <w:t>;</w:t>
-      </w:r>
-    </w:p>
-    <w:p>
-      <w:pPr>
-        <w:pStyle w:val="NoSpacing"/>
-      </w:pPr>
-      <w:r>
-        <w:t xml:space="preserve">    }</w:t>
-      </w:r>
-    </w:p>
-    <w:p>
-      <w:pPr>
-        <w:pStyle w:val="NoSpacing"/>
-      </w:pPr>
-      <w:r>
-        <w:t xml:space="preserve">    </w:t>
-      </w:r>
-      <w:proofErr w:type="gramStart"/>
-      <w:r>
-        <w:t>public</w:t>
-      </w:r>
-      <w:proofErr w:type="gramEnd"/>
-      <w:r>
-        <w:t xml:space="preserve"> void </w:t>
-      </w:r>
-      <w:proofErr w:type="spellStart"/>
-      <w:r>
-        <w:t>setFirstName</w:t>
-      </w:r>
-      <w:proofErr w:type="spellEnd"/>
-      <w:r>
-        <w:t xml:space="preserve">(String </w:t>
-      </w:r>
-      <w:proofErr w:type="spellStart"/>
-      <w:r>
-        <w:t>firstName</w:t>
-      </w:r>
-      <w:proofErr w:type="spellEnd"/>
-      <w:r>
-        <w:t>) {</w:t>
-      </w:r>
-    </w:p>
-    <w:p>
-      <w:pPr>
-        <w:pStyle w:val="NoSpacing"/>
-      </w:pPr>
-      <w:r>
-        <w:t xml:space="preserve">        </w:t>
-      </w:r>
-      <w:proofErr w:type="spellStart"/>
-      <w:r>
-        <w:t>this.firstName</w:t>
-      </w:r>
-      <w:proofErr w:type="spellEnd"/>
-      <w:r>
-        <w:t xml:space="preserve"> = </w:t>
-      </w:r>
-      <w:proofErr w:type="spellStart"/>
-      <w:r>
-        <w:t>firstName</w:t>
-      </w:r>
-      <w:proofErr w:type="spellEnd"/>
-      <w:r>
-        <w:t>;</w:t>
-      </w:r>
-    </w:p>
-    <w:p>
-      <w:pPr>
-        <w:pStyle w:val="NoSpacing"/>
-      </w:pPr>
-      <w:r>
-        <w:t xml:space="preserve">    }</w:t>
-      </w:r>
-    </w:p>
-    <w:p>
-      <w:pPr>
-        <w:pStyle w:val="NoSpacing"/>
-      </w:pPr>
-      <w:r>
-        <w:t xml:space="preserve">    </w:t>
-      </w:r>
-      <w:proofErr w:type="gramStart"/>
-      <w:r>
-        <w:t>public</w:t>
-      </w:r>
-      <w:proofErr w:type="gramEnd"/>
-      <w:r>
-        <w:t xml:space="preserve"> String </w:t>
-      </w:r>
-      <w:proofErr w:type="spellStart"/>
-      <w:r>
-        <w:t>getLastName</w:t>
-      </w:r>
-      <w:proofErr w:type="spellEnd"/>
-      <w:r>
-        <w:t>() {</w:t>
-      </w:r>
-    </w:p>
-    <w:p>
-      <w:pPr>
-        <w:pStyle w:val="NoSpacing"/>
-      </w:pPr>
-      <w:r>
-        <w:t xml:space="preserve">        </w:t>
-      </w:r>
-      <w:proofErr w:type="gramStart"/>
-      <w:r>
-        <w:t>return</w:t>
-      </w:r>
-      <w:proofErr w:type="gramEnd"/>
-      <w:r>
-        <w:t xml:space="preserve"> </w:t>
-      </w:r>
-      <w:proofErr w:type="spellStart"/>
-      <w:r>
-        <w:t>lastName</w:t>
-      </w:r>
-      <w:proofErr w:type="spellEnd"/>
-      <w:r>
-        <w:t>;</w:t>
-      </w:r>
-    </w:p>
-    <w:p>
-      <w:pPr>
-        <w:pStyle w:val="NoSpacing"/>
-      </w:pPr>
-      <w:r>
-        <w:t xml:space="preserve">    }</w:t>
-      </w:r>
-    </w:p>
-    <w:p>
-      <w:pPr>
-        <w:pStyle w:val="NoSpacing"/>
-      </w:pPr>
-      <w:r>
-        <w:t xml:space="preserve">    </w:t>
-      </w:r>
-      <w:proofErr w:type="gramStart"/>
-      <w:r>
-        <w:t>public</w:t>
-      </w:r>
-      <w:proofErr w:type="gramEnd"/>
-      <w:r>
-        <w:t xml:space="preserve"> void </w:t>
-      </w:r>
-      <w:proofErr w:type="spellStart"/>
-      <w:r>
-        <w:t>setLastName</w:t>
-      </w:r>
-      <w:proofErr w:type="spellEnd"/>
-      <w:r>
-        <w:t xml:space="preserve">(String </w:t>
-      </w:r>
-      <w:proofErr w:type="spellStart"/>
-      <w:r>
-        <w:t>lastName</w:t>
-      </w:r>
-      <w:proofErr w:type="spellEnd"/>
-      <w:r>
-        <w:t>) {</w:t>
-      </w:r>
-    </w:p>
-    <w:p>
-      <w:pPr>
-        <w:pStyle w:val="NoSpacing"/>
-      </w:pPr>
-      <w:r>
-        <w:t xml:space="preserve">        </w:t>
-      </w:r>
-      <w:proofErr w:type="spellStart"/>
-      <w:r>
-        <w:t>this.lastName</w:t>
-      </w:r>
-      <w:proofErr w:type="spellEnd"/>
-      <w:r>
-        <w:t xml:space="preserve"> = </w:t>
-      </w:r>
-      <w:proofErr w:type="spellStart"/>
-      <w:r>
-        <w:t>lastName</w:t>
-      </w:r>
-      <w:proofErr w:type="spellEnd"/>
-      <w:r>
-        <w:t>;</w:t>
-      </w:r>
-    </w:p>
-    <w:p>
-      <w:pPr>
-        <w:pStyle w:val="NoSpacing"/>
-      </w:pPr>
-      <w:r>
-        <w:t xml:space="preserve">    }</w:t>
-      </w:r>
-    </w:p>
-    <w:p>
-      <w:pPr>
-        <w:pStyle w:val="NoSpacing"/>
-      </w:pPr>
-      <w:r>
-        <w:t xml:space="preserve">    </w:t>
-      </w:r>
-      <w:proofErr w:type="gramStart"/>
-      <w:r>
-        <w:t>public</w:t>
-      </w:r>
-      <w:proofErr w:type="gramEnd"/>
-      <w:r>
-        <w:t xml:space="preserve"> String </w:t>
-      </w:r>
-      <w:proofErr w:type="spellStart"/>
-      <w:r>
-        <w:t>getUsername</w:t>
-      </w:r>
-      <w:proofErr w:type="spellEnd"/>
-      <w:r>
-        <w:t>() {</w:t>
-      </w:r>
-    </w:p>
-    <w:p>
-      <w:pPr>
-        <w:pStyle w:val="NoSpacing"/>
-      </w:pPr>
-      <w:r>
-        <w:t xml:space="preserve">        </w:t>
-      </w:r>
-      <w:proofErr w:type="gramStart"/>
-      <w:r>
-        <w:t>return</w:t>
-      </w:r>
-      <w:proofErr w:type="gramEnd"/>
-      <w:r>
-        <w:t xml:space="preserve"> username;</w:t>
-      </w:r>
-    </w:p>
-    <w:p>
-      <w:pPr>
-        <w:pStyle w:val="NoSpacing"/>
-      </w:pPr>
-      <w:r>
-        <w:t xml:space="preserve">    }</w:t>
-      </w:r>
-    </w:p>
-    <w:p>
-      <w:pPr>
-        <w:pStyle w:val="NoSpacing"/>
-      </w:pPr>
-      <w:r>
-        <w:t xml:space="preserve">    </w:t>
-      </w:r>
-      <w:proofErr w:type="gramStart"/>
-      <w:r>
-        <w:t>public</w:t>
-      </w:r>
-      <w:proofErr w:type="gramEnd"/>
-      <w:r>
-        <w:t xml:space="preserve"> void </w:t>
-      </w:r>
-      <w:proofErr w:type="spellStart"/>
-      <w:r>
-        <w:t>setUsername</w:t>
-      </w:r>
-      <w:proofErr w:type="spellEnd"/>
-      <w:r>
-        <w:t>(String username) {</w:t>
-      </w:r>
-    </w:p>
-    <w:p>
-      <w:pPr>
-        <w:pStyle w:val="NoSpacing"/>
-      </w:pPr>
-      <w:r>
-        <w:t xml:space="preserve">        </w:t>
-      </w:r>
-      <w:proofErr w:type="spellStart"/>
-      <w:r>
-        <w:t>this.username</w:t>
-      </w:r>
-      <w:proofErr w:type="spellEnd"/>
-      <w:r>
-        <w:t xml:space="preserve"> = username;</w:t>
-      </w:r>
-    </w:p>
-    <w:p>
-      <w:pPr>
-        <w:pStyle w:val="NoSpacing"/>
-      </w:pPr>
-      <w:r>
-        <w:t xml:space="preserve">    }</w:t>
-      </w:r>
-    </w:p>
-    <w:p>
-      <w:pPr>
-        <w:pStyle w:val="NoSpacing"/>
-      </w:pPr>
-      <w:r>
-        <w:t xml:space="preserve">    </w:t>
-      </w:r>
-      <w:proofErr w:type="gramStart"/>
-      <w:r>
-        <w:t>public</w:t>
-      </w:r>
-      <w:proofErr w:type="gramEnd"/>
-      <w:r>
-        <w:t xml:space="preserve"> String </w:t>
-      </w:r>
-      <w:proofErr w:type="spellStart"/>
-      <w:r>
-        <w:t>getPassword</w:t>
-      </w:r>
-      <w:proofErr w:type="spellEnd"/>
-      <w:r>
-        <w:t>() {</w:t>
-      </w:r>
-    </w:p>
-    <w:p>
-      <w:pPr>
-        <w:pStyle w:val="NoSpacing"/>
-      </w:pPr>
-      <w:r>
-        <w:t xml:space="preserve">        </w:t>
-      </w:r>
-      <w:proofErr w:type="gramStart"/>
-      <w:r>
-        <w:t>return</w:t>
-      </w:r>
-      <w:proofErr w:type="gramEnd"/>
-      <w:r>
-        <w:t xml:space="preserve"> password;</w:t>
-      </w:r>
-    </w:p>
-    <w:p>
-      <w:pPr>
-        <w:pStyle w:val="NoSpacing"/>
-      </w:pPr>
-      <w:r>
-        <w:t xml:space="preserve">    }</w:t>
-      </w:r>
-    </w:p>
-    <w:p>
-      <w:pPr>
-        <w:pStyle w:val="NoSpacing"/>
-      </w:pPr>
-      <w:r>
-        <w:t xml:space="preserve">    </w:t>
-      </w:r>
-      <w:proofErr w:type="gramStart"/>
-      <w:r>
-        <w:t>public</w:t>
-      </w:r>
-      <w:proofErr w:type="gramEnd"/>
-      <w:r>
-        <w:t xml:space="preserve"> void </w:t>
-      </w:r>
-      <w:proofErr w:type="spellStart"/>
-      <w:r>
-        <w:t>setPassword</w:t>
-      </w:r>
-      <w:proofErr w:type="spellEnd"/>
-      <w:r>
-        <w:t>(String password) {</w:t>
-      </w:r>
-    </w:p>
-    <w:p>
-      <w:pPr>
-        <w:pStyle w:val="NoSpacing"/>
-      </w:pPr>
-      <w:r>
-        <w:t xml:space="preserve">        </w:t>
-      </w:r>
-      <w:proofErr w:type="spellStart"/>
-      <w:r>
-        <w:t>this.password</w:t>
-      </w:r>
-      <w:proofErr w:type="spellEnd"/>
-      <w:r>
-        <w:t xml:space="preserve"> = password;</w:t>
-      </w:r>
-    </w:p>
-    <w:p>
-      <w:pPr>
-        <w:pStyle w:val="NoSpacing"/>
-      </w:pPr>
-      <w:r>
-        <w:t xml:space="preserve">    }</w:t>
+        <w:t>);</w:t>
       </w:r>
     </w:p>
     <w:p>
@@ -9328,590 +8776,34 @@
       <w:r>
         <w:tab/>
       </w:r>
-      <w:proofErr w:type="gramStart"/>
-      <w:r>
-        <w:t>public</w:t>
-      </w:r>
-      <w:proofErr w:type="gramEnd"/>
-      <w:r>
-        <w:t xml:space="preserve"> User(</w:t>
-      </w:r>
-      <w:proofErr w:type="spellStart"/>
-      <w:r>
-        <w:t>int</w:t>
-      </w:r>
-      <w:proofErr w:type="spellEnd"/>
-      <w:r>
-        <w:t xml:space="preserve"> id, String </w:t>
-      </w:r>
-      <w:proofErr w:type="spellStart"/>
-      <w:r>
-        <w:t>firstName</w:t>
-      </w:r>
-      <w:proofErr w:type="spellEnd"/>
-      <w:r>
-        <w:t xml:space="preserve">, String </w:t>
-      </w:r>
-      <w:proofErr w:type="spellStart"/>
-      <w:r>
-        <w:t>lastName</w:t>
-      </w:r>
-      <w:proofErr w:type="spellEnd"/>
-      <w:r>
-        <w:t>, String username, String password) {</w:t>
-      </w:r>
-    </w:p>
-    <w:p>
-      <w:pPr>
-        <w:pStyle w:val="NoSpacing"/>
-      </w:pPr>
       <w:r>
         <w:tab/>
-      </w:r>
-      <w:r>
-        <w:tab/>
-      </w:r>
-      <w:proofErr w:type="gramStart"/>
-      <w:r>
-        <w:t>super(</w:t>
-      </w:r>
-      <w:proofErr w:type="gramEnd"/>
-      <w:r>
-        <w:t>);</w:t>
-      </w:r>
-    </w:p>
-    <w:p>
-      <w:pPr>
-        <w:pStyle w:val="NoSpacing"/>
-      </w:pPr>
-      <w:r>
-        <w:tab/>
-      </w:r>
-      <w:r>
-        <w:tab/>
-        <w:t>this.id = id;</w:t>
-      </w:r>
-    </w:p>
-    <w:p>
-      <w:pPr>
-        <w:pStyle w:val="NoSpacing"/>
-      </w:pPr>
-      <w:r>
-        <w:tab/>
-      </w:r>
-      <w:r>
-        <w:tab/>
-      </w:r>
-      <w:proofErr w:type="spellStart"/>
-      <w:r>
-        <w:t>this.firstName</w:t>
-      </w:r>
-      <w:proofErr w:type="spellEnd"/>
-      <w:r>
-        <w:t xml:space="preserve"> = </w:t>
-      </w:r>
-      <w:proofErr w:type="spellStart"/>
-      <w:r>
-        <w:t>firstName</w:t>
-      </w:r>
-      <w:proofErr w:type="spellEnd"/>
-      <w:r>
-        <w:t>;</w:t>
-      </w:r>
-    </w:p>
-    <w:p>
-      <w:pPr>
-        <w:pStyle w:val="NoSpacing"/>
-      </w:pPr>
-      <w:r>
-        <w:tab/>
-      </w:r>
-      <w:r>
-        <w:tab/>
-      </w:r>
-      <w:proofErr w:type="spellStart"/>
-      <w:r>
-        <w:t>this.lastName</w:t>
-      </w:r>
-      <w:proofErr w:type="spellEnd"/>
-      <w:r>
-        <w:t xml:space="preserve"> = </w:t>
-      </w:r>
-      <w:proofErr w:type="spellStart"/>
-      <w:r>
-        <w:t>lastName</w:t>
-      </w:r>
-      <w:proofErr w:type="spellEnd"/>
-      <w:r>
-        <w:t>;</w:t>
-      </w:r>
-    </w:p>
-    <w:p>
-      <w:pPr>
-        <w:pStyle w:val="NoSpacing"/>
-      </w:pPr>
-      <w:r>
-        <w:tab/>
-      </w:r>
-      <w:r>
-        <w:tab/>
-      </w:r>
-      <w:proofErr w:type="spellStart"/>
-      <w:r>
-        <w:t>this.username</w:t>
-      </w:r>
-      <w:proofErr w:type="spellEnd"/>
-      <w:r>
-        <w:t xml:space="preserve"> = username;</w:t>
-      </w:r>
-    </w:p>
-    <w:p>
-      <w:pPr>
-        <w:pStyle w:val="NoSpacing"/>
-      </w:pPr>
-      <w:r>
-        <w:tab/>
-      </w:r>
-      <w:r>
-        <w:tab/>
-      </w:r>
-      <w:proofErr w:type="spellStart"/>
-      <w:r>
-        <w:t>this.password</w:t>
-      </w:r>
-      <w:proofErr w:type="spellEnd"/>
-      <w:r>
-        <w:t xml:space="preserve"> = password;</w:t>
-      </w:r>
-    </w:p>
-    <w:p>
-      <w:pPr>
-        <w:pStyle w:val="NoSpacing"/>
-      </w:pPr>
-      <w:r>
-        <w:tab/>
-        <w:t>}</w:t>
-      </w:r>
-    </w:p>
-    <w:p>
-      <w:pPr>
-        <w:pStyle w:val="NoSpacing"/>
-      </w:pPr>
-      <w:r>
-        <w:tab/>
-      </w:r>
-      <w:proofErr w:type="gramStart"/>
-      <w:r>
-        <w:t>public</w:t>
-      </w:r>
-      <w:proofErr w:type="gramEnd"/>
-      <w:r>
-        <w:t xml:space="preserve"> User() {</w:t>
-      </w:r>
-    </w:p>
-    <w:p>
-      <w:pPr>
-        <w:pStyle w:val="NoSpacing"/>
-      </w:pPr>
-      <w:r>
-        <w:tab/>
-      </w:r>
-      <w:r>
-        <w:tab/>
-      </w:r>
-      <w:proofErr w:type="gramStart"/>
-      <w:r>
-        <w:t>super(</w:t>
-      </w:r>
-      <w:proofErr w:type="gramEnd"/>
-      <w:r>
-        <w:t>);</w:t>
-      </w:r>
-    </w:p>
-    <w:p>
-      <w:pPr>
-        <w:pStyle w:val="NoSpacing"/>
-      </w:pPr>
-      <w:r>
-        <w:tab/>
-        <w:t>}</w:t>
-      </w:r>
-    </w:p>
-    <w:p>
-      <w:pPr>
-        <w:pStyle w:val="NoSpacing"/>
-      </w:pPr>
-      <w:r>
-        <w:t xml:space="preserve">    </w:t>
-      </w:r>
-    </w:p>
-    <w:p>
-      <w:pPr>
-        <w:pStyle w:val="NoSpacing"/>
-      </w:pPr>
-      <w:r>
-        <w:t>}</w:t>
-      </w:r>
-    </w:p>
-    <w:p>
-      <w:pPr>
-        <w:pStyle w:val="NoSpacing"/>
-      </w:pPr>
-    </w:p>
-    <w:p>
-      <w:pPr>
-        <w:rPr>
-          <w:b/>
-          <w:sz w:val="28"/>
-          <w:szCs w:val="28"/>
-        </w:rPr>
-      </w:pPr>
-      <w:r>
-        <w:rPr>
-          <w:b/>
-          <w:sz w:val="28"/>
-          <w:szCs w:val="28"/>
-        </w:rPr>
-        <w:t>All DAO must be under Repository package</w:t>
-      </w:r>
-    </w:p>
-    <w:p>
-      <w:pPr>
-        <w:pStyle w:val="NoSpacing"/>
-      </w:pPr>
-      <w:proofErr w:type="gramStart"/>
-      <w:r>
-        <w:t>package</w:t>
-      </w:r>
-      <w:proofErr w:type="gramEnd"/>
-      <w:r>
-        <w:t xml:space="preserve"> Repository;</w:t>
-      </w:r>
-    </w:p>
-    <w:p>
-      <w:pPr>
-        <w:pStyle w:val="NoSpacing"/>
-      </w:pPr>
-      <w:proofErr w:type="gramStart"/>
-      <w:r>
-        <w:t>import</w:t>
-      </w:r>
-      <w:proofErr w:type="gramEnd"/>
-      <w:r>
-        <w:t xml:space="preserve"> </w:t>
-      </w:r>
-      <w:proofErr w:type="spellStart"/>
-      <w:r>
-        <w:t>java.util.List</w:t>
-      </w:r>
-      <w:proofErr w:type="spellEnd"/>
-      <w:r>
-        <w:t>;</w:t>
-      </w:r>
-    </w:p>
-    <w:p>
-      <w:pPr>
-        <w:pStyle w:val="NoSpacing"/>
-      </w:pPr>
-    </w:p>
-    <w:p>
-      <w:pPr>
-        <w:pStyle w:val="NoSpacing"/>
-      </w:pPr>
-      <w:proofErr w:type="gramStart"/>
-      <w:r>
-        <w:t>import</w:t>
-      </w:r>
-      <w:proofErr w:type="gramEnd"/>
-      <w:r>
-        <w:t xml:space="preserve"> </w:t>
-      </w:r>
-      <w:proofErr w:type="spellStart"/>
-      <w:r>
-        <w:t>org.hibernate.Session</w:t>
-      </w:r>
-      <w:proofErr w:type="spellEnd"/>
-      <w:r>
-        <w:t>;</w:t>
-      </w:r>
-    </w:p>
-    <w:p>
-      <w:pPr>
-        <w:pStyle w:val="NoSpacing"/>
-      </w:pPr>
-      <w:proofErr w:type="gramStart"/>
-      <w:r>
-        <w:t>import</w:t>
-      </w:r>
-      <w:proofErr w:type="gramEnd"/>
-      <w:r>
-        <w:t xml:space="preserve"> </w:t>
-      </w:r>
-      <w:proofErr w:type="spellStart"/>
-      <w:r>
-        <w:t>org.hibernate.SessionFactory</w:t>
-      </w:r>
-      <w:proofErr w:type="spellEnd"/>
-      <w:r>
-        <w:t>;</w:t>
-      </w:r>
-    </w:p>
-    <w:p>
-      <w:pPr>
-        <w:pStyle w:val="NoSpacing"/>
-      </w:pPr>
-      <w:proofErr w:type="gramStart"/>
-      <w:r>
-        <w:t>import</w:t>
-      </w:r>
-      <w:proofErr w:type="gramEnd"/>
-      <w:r>
-        <w:t xml:space="preserve"> </w:t>
-      </w:r>
-      <w:proofErr w:type="spellStart"/>
-      <w:r>
-        <w:t>org.hibernate.Transaction</w:t>
-      </w:r>
-      <w:proofErr w:type="spellEnd"/>
-      <w:r>
-        <w:t>;</w:t>
-      </w:r>
-    </w:p>
-    <w:p>
-      <w:pPr>
-        <w:pStyle w:val="NoSpacing"/>
-      </w:pPr>
-      <w:proofErr w:type="gramStart"/>
-      <w:r>
-        <w:t>import</w:t>
-      </w:r>
-      <w:proofErr w:type="gramEnd"/>
-      <w:r>
-        <w:t xml:space="preserve"> </w:t>
-      </w:r>
-      <w:proofErr w:type="spellStart"/>
-      <w:r>
-        <w:t>org.hibernate.cfg.Configuration</w:t>
-      </w:r>
-      <w:proofErr w:type="spellEnd"/>
-      <w:r>
-        <w:t>;</w:t>
-      </w:r>
-    </w:p>
-    <w:p>
-      <w:pPr>
-        <w:pStyle w:val="NoSpacing"/>
-      </w:pPr>
-    </w:p>
-    <w:p>
-      <w:pPr>
-        <w:pStyle w:val="NoSpacing"/>
-      </w:pPr>
-      <w:proofErr w:type="gramStart"/>
-      <w:r>
-        <w:t>import</w:t>
-      </w:r>
-      <w:proofErr w:type="gramEnd"/>
-      <w:r>
-        <w:t xml:space="preserve"> </w:t>
-      </w:r>
-      <w:proofErr w:type="spellStart"/>
-      <w:r>
-        <w:t>Model.User</w:t>
-      </w:r>
-      <w:proofErr w:type="spellEnd"/>
-      <w:r>
-        <w:t>;</w:t>
-      </w:r>
-    </w:p>
-    <w:p>
-      <w:pPr>
-        <w:pStyle w:val="NoSpacing"/>
-      </w:pPr>
-    </w:p>
-    <w:p>
-      <w:pPr>
-        <w:pStyle w:val="NoSpacing"/>
-      </w:pPr>
-      <w:proofErr w:type="gramStart"/>
-      <w:r>
-        <w:t>public</w:t>
-      </w:r>
-      <w:proofErr w:type="gramEnd"/>
-      <w:r>
-        <w:t xml:space="preserve"> class </w:t>
-      </w:r>
-      <w:proofErr w:type="spellStart"/>
-      <w:r>
-        <w:t>UserDAO</w:t>
-      </w:r>
-      <w:proofErr w:type="spellEnd"/>
-      <w:r>
-        <w:t xml:space="preserve"> {</w:t>
-      </w:r>
-    </w:p>
-    <w:p>
-      <w:pPr>
-        <w:pStyle w:val="NoSpacing"/>
-      </w:pPr>
-      <w:r>
-        <w:lastRenderedPageBreak/>
-        <w:tab/>
-        <w:t>Configuration configuration=null;</w:t>
-      </w:r>
-    </w:p>
-    <w:p>
-      <w:pPr>
-        <w:pStyle w:val="NoSpacing"/>
-      </w:pPr>
-      <w:r>
-        <w:tab/>
-      </w:r>
-      <w:proofErr w:type="spellStart"/>
-      <w:r>
-        <w:t>SessionFactory</w:t>
-      </w:r>
-      <w:proofErr w:type="spellEnd"/>
-      <w:r>
-        <w:t xml:space="preserve"> </w:t>
-      </w:r>
-      <w:proofErr w:type="spellStart"/>
-      <w:r>
-        <w:t>sessionFactory</w:t>
-      </w:r>
-      <w:proofErr w:type="spellEnd"/>
-      <w:r>
-        <w:t>=null;</w:t>
-      </w:r>
-    </w:p>
-    <w:p>
-      <w:pPr>
-        <w:pStyle w:val="NoSpacing"/>
-      </w:pPr>
-      <w:r>
-        <w:tab/>
-        <w:t>Session session=null;</w:t>
-      </w:r>
-    </w:p>
-    <w:p>
-      <w:pPr>
-        <w:pStyle w:val="NoSpacing"/>
-      </w:pPr>
-      <w:r>
-        <w:tab/>
-      </w:r>
-      <w:proofErr w:type="gramStart"/>
-      <w:r>
-        <w:t>public</w:t>
-      </w:r>
-      <w:proofErr w:type="gramEnd"/>
-      <w:r>
-        <w:t xml:space="preserve"> </w:t>
-      </w:r>
-      <w:proofErr w:type="spellStart"/>
-      <w:r>
-        <w:t>UserDAO</w:t>
-      </w:r>
-      <w:proofErr w:type="spellEnd"/>
-      <w:r>
-        <w:t>() {</w:t>
-      </w:r>
-    </w:p>
-    <w:p>
-      <w:pPr>
-        <w:pStyle w:val="NoSpacing"/>
-      </w:pPr>
-      <w:r>
-        <w:tab/>
-      </w:r>
-      <w:r>
-        <w:tab/>
-        <w:t xml:space="preserve"> //1. </w:t>
-      </w:r>
-      <w:proofErr w:type="gramStart"/>
-      <w:r>
-        <w:t>create</w:t>
-      </w:r>
-      <w:proofErr w:type="gramEnd"/>
-      <w:r>
-        <w:t xml:space="preserve"> Configuration object</w:t>
-      </w:r>
-    </w:p>
-    <w:p>
-      <w:pPr>
-        <w:pStyle w:val="NoSpacing"/>
-      </w:pPr>
-      <w:r>
-        <w:tab/>
-        <w:t xml:space="preserve">     </w:t>
-      </w:r>
-      <w:proofErr w:type="gramStart"/>
-      <w:r>
-        <w:t>configuration=</w:t>
-      </w:r>
-      <w:proofErr w:type="gramEnd"/>
-      <w:r>
-        <w:t>new Configuration().configure().</w:t>
-      </w:r>
-      <w:proofErr w:type="spellStart"/>
-      <w:r>
-        <w:t>addAnnotatedClass</w:t>
-      </w:r>
-      <w:proofErr w:type="spellEnd"/>
-      <w:r>
-        <w:t>(</w:t>
-      </w:r>
-      <w:proofErr w:type="spellStart"/>
-      <w:r>
-        <w:t>User.class</w:t>
-      </w:r>
-      <w:proofErr w:type="spellEnd"/>
-      <w:r>
-        <w:t>);</w:t>
-      </w:r>
-    </w:p>
-    <w:p>
-      <w:pPr>
-        <w:pStyle w:val="NoSpacing"/>
-      </w:pPr>
-      <w:r>
-        <w:tab/>
-        <w:t xml:space="preserve">    //2. </w:t>
-      </w:r>
-      <w:proofErr w:type="gramStart"/>
-      <w:r>
-        <w:t>create</w:t>
-      </w:r>
-      <w:proofErr w:type="gramEnd"/>
-      <w:r>
-        <w:t xml:space="preserve"> Session Factory object </w:t>
-      </w:r>
-    </w:p>
-    <w:p>
-      <w:pPr>
-        <w:pStyle w:val="NoSpacing"/>
-      </w:pPr>
-      <w:r>
-        <w:tab/>
-        <w:t xml:space="preserve">     </w:t>
       </w:r>
       <w:proofErr w:type="spellStart"/>
       <w:proofErr w:type="gramStart"/>
       <w:r>
-        <w:t>sessionFactory</w:t>
+        <w:t>user.setFirstName</w:t>
       </w:r>
       <w:proofErr w:type="spellEnd"/>
       <w:r>
-        <w:t>=</w:t>
+        <w:t>(</w:t>
       </w:r>
       <w:proofErr w:type="spellStart"/>
       <w:proofErr w:type="gramEnd"/>
       <w:r>
-        <w:t>configuration.buildSessionFactory</w:t>
+        <w:t>request.getParameter</w:t>
       </w:r>
       <w:proofErr w:type="spellEnd"/>
       <w:r>
-        <w:t>();</w:t>
+        <w:t>("</w:t>
+      </w:r>
+      <w:proofErr w:type="spellStart"/>
+      <w:r>
+        <w:t>firstName</w:t>
+      </w:r>
+      <w:proofErr w:type="spellEnd"/>
+      <w:r>
+        <w:t>"));</w:t>
       </w:r>
     </w:p>
     <w:p>
@@ -9920,29 +8812,35 @@
       </w:pPr>
       <w:r>
         <w:tab/>
-        <w:t xml:space="preserve">    //3. Create Session object</w:t>
-      </w:r>
-    </w:p>
-    <w:p>
-      <w:pPr>
-        <w:pStyle w:val="NoSpacing"/>
-      </w:pPr>
+      </w:r>
       <w:r>
         <w:tab/>
-        <w:t xml:space="preserve">     </w:t>
-      </w:r>
+      </w:r>
+      <w:proofErr w:type="spellStart"/>
       <w:proofErr w:type="gramStart"/>
       <w:r>
-        <w:t>session=</w:t>
+        <w:t>user.setLastName</w:t>
+      </w:r>
+      <w:proofErr w:type="spellEnd"/>
+      <w:r>
+        <w:t>(</w:t>
       </w:r>
       <w:proofErr w:type="spellStart"/>
       <w:proofErr w:type="gramEnd"/>
       <w:r>
-        <w:t>sessionFactory.openSession</w:t>
+        <w:t>request.getParameter</w:t>
       </w:r>
       <w:proofErr w:type="spellEnd"/>
       <w:r>
-        <w:t>();</w:t>
+        <w:t>("</w:t>
+      </w:r>
+      <w:proofErr w:type="spellStart"/>
+      <w:r>
+        <w:t>lastName</w:t>
+      </w:r>
+      <w:proofErr w:type="spellEnd"/>
+      <w:r>
+        <w:t>"));</w:t>
       </w:r>
     </w:p>
     <w:p>
@@ -9951,106 +8849,88 @@
       </w:pPr>
       <w:r>
         <w:tab/>
-        <w:t>}</w:t>
-      </w:r>
-    </w:p>
-    <w:p>
-      <w:pPr>
-        <w:pStyle w:val="NoSpacing"/>
-      </w:pPr>
+      </w:r>
       <w:r>
         <w:tab/>
-      </w:r>
-      <w:proofErr w:type="gramStart"/>
-      <w:r>
-        <w:t>public</w:t>
-      </w:r>
-      <w:proofErr w:type="gramEnd"/>
-      <w:r>
-        <w:t xml:space="preserve"> void </w:t>
-      </w:r>
-      <w:proofErr w:type="spellStart"/>
-      <w:r>
-        <w:t>saveUser</w:t>
-      </w:r>
-      <w:proofErr w:type="spellEnd"/>
-      <w:r>
-        <w:t>(User user) {</w:t>
-      </w:r>
-    </w:p>
-    <w:p>
-      <w:pPr>
-        <w:pStyle w:val="NoSpacing"/>
-      </w:pPr>
-      <w:r>
-        <w:t xml:space="preserve"> </w:t>
-      </w:r>
-      <w:r>
-        <w:tab/>
-        <w:t xml:space="preserve">     //4. Begin your transaction</w:t>
-      </w:r>
-    </w:p>
-    <w:p>
-      <w:pPr>
-        <w:pStyle w:val="NoSpacing"/>
-      </w:pPr>
-      <w:r>
-        <w:t xml:space="preserve">    Transaction transaction=</w:t>
       </w:r>
       <w:proofErr w:type="spellStart"/>
       <w:proofErr w:type="gramStart"/>
       <w:r>
-        <w:t>session.beginTransaction</w:t>
+        <w:t>user.setUsername</w:t>
       </w:r>
       <w:proofErr w:type="spellEnd"/>
       <w:r>
         <w:t>(</w:t>
       </w:r>
+      <w:proofErr w:type="spellStart"/>
       <w:proofErr w:type="gramEnd"/>
       <w:r>
-        <w:t>);</w:t>
-      </w:r>
-    </w:p>
-    <w:p>
-      <w:pPr>
-        <w:pStyle w:val="NoSpacing"/>
-      </w:pPr>
-      <w:r>
-        <w:t xml:space="preserve">    //5.Save your object to database</w:t>
-      </w:r>
-    </w:p>
-    <w:p>
-      <w:pPr>
-        <w:pStyle w:val="NoSpacing"/>
-      </w:pPr>
-      <w:r>
-        <w:t xml:space="preserve">    </w:t>
+        <w:t>request.getParameter</w:t>
+      </w:r>
+      <w:proofErr w:type="spellEnd"/>
+      <w:r>
+        <w:t>("username"));</w:t>
+      </w:r>
+    </w:p>
+    <w:p>
+      <w:pPr>
+        <w:pStyle w:val="NoSpacing"/>
+      </w:pPr>
+      <w:r>
+        <w:tab/>
+      </w:r>
+      <w:r>
+        <w:tab/>
       </w:r>
       <w:proofErr w:type="spellStart"/>
       <w:proofErr w:type="gramStart"/>
       <w:r>
-        <w:t>session.save</w:t>
+        <w:t>user.setPassword</w:t>
       </w:r>
       <w:proofErr w:type="spellEnd"/>
       <w:r>
         <w:t>(</w:t>
       </w:r>
+      <w:proofErr w:type="spellStart"/>
       <w:proofErr w:type="gramEnd"/>
       <w:r>
-        <w:t xml:space="preserve">user);    </w:t>
-      </w:r>
-    </w:p>
-    <w:p>
-      <w:pPr>
-        <w:pStyle w:val="NoSpacing"/>
-      </w:pPr>
-      <w:r>
-        <w:t xml:space="preserve">    </w:t>
+        <w:t>request.getParameter</w:t>
+      </w:r>
+      <w:proofErr w:type="spellEnd"/>
+      <w:r>
+        <w:t>("password"));</w:t>
+      </w:r>
+    </w:p>
+    <w:p>
+      <w:pPr>
+        <w:pStyle w:val="NoSpacing"/>
+      </w:pPr>
+      <w:r>
+        <w:tab/>
+      </w:r>
+      <w:r>
+        <w:tab/>
+      </w:r>
+      <w:proofErr w:type="spellStart"/>
+      <w:r>
+        <w:t>UserDAO</w:t>
+      </w:r>
+      <w:proofErr w:type="spellEnd"/>
+      <w:r>
+        <w:t xml:space="preserve"> </w:t>
+      </w:r>
+      <w:proofErr w:type="spellStart"/>
+      <w:r>
+        <w:t>dao</w:t>
+      </w:r>
+      <w:proofErr w:type="spellEnd"/>
+      <w:r>
+        <w:t xml:space="preserve">=new </w:t>
       </w:r>
       <w:proofErr w:type="spellStart"/>
       <w:proofErr w:type="gramStart"/>
       <w:r>
-        <w:t>System.out.println</w:t>
+        <w:t>UserDAO</w:t>
       </w:r>
       <w:proofErr w:type="spellEnd"/>
       <w:r>
@@ -10058,35 +8938,6 @@
       </w:r>
       <w:proofErr w:type="gramEnd"/>
       <w:r>
-        <w:t>"Saved");</w:t>
-      </w:r>
-    </w:p>
-    <w:p>
-      <w:pPr>
-        <w:pStyle w:val="NoSpacing"/>
-      </w:pPr>
-      <w:r>
-        <w:t xml:space="preserve">    //6. Commit your transaction </w:t>
-      </w:r>
-    </w:p>
-    <w:p>
-      <w:pPr>
-        <w:pStyle w:val="NoSpacing"/>
-      </w:pPr>
-      <w:r>
-        <w:t xml:space="preserve">    </w:t>
-      </w:r>
-      <w:proofErr w:type="spellStart"/>
-      <w:proofErr w:type="gramStart"/>
-      <w:r>
-        <w:t>transaction.commit</w:t>
-      </w:r>
-      <w:proofErr w:type="spellEnd"/>
-      <w:r>
-        <w:t>(</w:t>
-      </w:r>
-      <w:proofErr w:type="gramEnd"/>
-      <w:r>
         <w:t>);</w:t>
       </w:r>
     </w:p>
@@ -10095,603 +8946,6 @@
         <w:pStyle w:val="NoSpacing"/>
       </w:pPr>
       <w:r>
-        <w:t xml:space="preserve">    </w:t>
-      </w:r>
-      <w:proofErr w:type="spellStart"/>
-      <w:proofErr w:type="gramStart"/>
-      <w:r>
-        <w:t>session.close</w:t>
-      </w:r>
-      <w:proofErr w:type="spellEnd"/>
-      <w:r>
-        <w:t>(</w:t>
-      </w:r>
-      <w:proofErr w:type="gramEnd"/>
-      <w:r>
-        <w:t>);</w:t>
-      </w:r>
-    </w:p>
-    <w:p>
-      <w:pPr>
-        <w:pStyle w:val="NoSpacing"/>
-      </w:pPr>
-      <w:r>
-        <w:t xml:space="preserve">    </w:t>
-      </w:r>
-      <w:proofErr w:type="spellStart"/>
-      <w:proofErr w:type="gramStart"/>
-      <w:r>
-        <w:t>sessionFactory.close</w:t>
-      </w:r>
-      <w:proofErr w:type="spellEnd"/>
-      <w:r>
-        <w:t>(</w:t>
-      </w:r>
-      <w:proofErr w:type="gramEnd"/>
-      <w:r>
-        <w:t>);</w:t>
-      </w:r>
-    </w:p>
-    <w:p>
-      <w:pPr>
-        <w:pStyle w:val="NoSpacing"/>
-      </w:pPr>
-      <w:r>
-        <w:tab/>
-        <w:t>}</w:t>
-      </w:r>
-    </w:p>
-    <w:p>
-      <w:pPr>
-        <w:pStyle w:val="NoSpacing"/>
-      </w:pPr>
-      <w:r>
-        <w:t>}</w:t>
-      </w:r>
-    </w:p>
-    <w:p>
-      <w:pPr>
-        <w:pStyle w:val="NoSpacing"/>
-      </w:pPr>
-      <w:r>
-        <w:tab/>
-      </w:r>
-    </w:p>
-    <w:p>
-      <w:pPr>
-        <w:rPr>
-          <w:b/>
-          <w:sz w:val="28"/>
-          <w:szCs w:val="28"/>
-        </w:rPr>
-      </w:pPr>
-    </w:p>
-    <w:p>
-      <w:pPr>
-        <w:rPr>
-          <w:sz w:val="28"/>
-          <w:szCs w:val="28"/>
-        </w:rPr>
-      </w:pPr>
-      <w:r>
-        <w:rPr>
-          <w:sz w:val="28"/>
-          <w:szCs w:val="28"/>
-        </w:rPr>
-        <w:t xml:space="preserve">All Servlets must be created inside </w:t>
-      </w:r>
-      <w:proofErr w:type="gramStart"/>
-      <w:r>
-        <w:rPr>
-          <w:sz w:val="28"/>
-          <w:szCs w:val="28"/>
-        </w:rPr>
-        <w:t>classes</w:t>
-      </w:r>
-      <w:proofErr w:type="gramEnd"/>
-      <w:r>
-        <w:rPr>
-          <w:sz w:val="28"/>
-          <w:szCs w:val="28"/>
-        </w:rPr>
-        <w:t xml:space="preserve"> folder inside </w:t>
-      </w:r>
-      <w:proofErr w:type="spellStart"/>
-      <w:r>
-        <w:rPr>
-          <w:sz w:val="28"/>
-          <w:szCs w:val="28"/>
-        </w:rPr>
-        <w:t>webapp</w:t>
-      </w:r>
-      <w:proofErr w:type="spellEnd"/>
-      <w:r>
-        <w:rPr>
-          <w:sz w:val="28"/>
-          <w:szCs w:val="28"/>
-        </w:rPr>
-        <w:t>/WEB-INF</w:t>
-      </w:r>
-    </w:p>
-    <w:p>
-      <w:pPr>
-        <w:rPr>
-          <w:sz w:val="28"/>
-          <w:szCs w:val="28"/>
-        </w:rPr>
-      </w:pPr>
-      <w:r>
-        <w:rPr>
-          <w:sz w:val="28"/>
-          <w:szCs w:val="28"/>
-        </w:rPr>
-        <w:t>Right click, Create folder classes, select classes folder -&gt; right click-&gt; servlet</w:t>
-      </w:r>
-    </w:p>
-    <w:p>
-      <w:pPr>
-        <w:pStyle w:val="NoSpacing"/>
-      </w:pPr>
-      <w:r>
-        <w:t xml:space="preserve">Give name Register, Select </w:t>
-      </w:r>
-      <w:proofErr w:type="spellStart"/>
-      <w:r>
-        <w:t>doPost</w:t>
-      </w:r>
-      <w:proofErr w:type="spellEnd"/>
-    </w:p>
-    <w:p>
-      <w:pPr>
-        <w:rPr>
-          <w:sz w:val="28"/>
-          <w:szCs w:val="28"/>
-        </w:rPr>
-      </w:pPr>
-    </w:p>
-    <w:p>
-      <w:pPr>
-        <w:pStyle w:val="NoSpacing"/>
-      </w:pPr>
-      <w:proofErr w:type="gramStart"/>
-      <w:r>
-        <w:t>import</w:t>
-      </w:r>
-      <w:proofErr w:type="gramEnd"/>
-      <w:r>
-        <w:t xml:space="preserve"> </w:t>
-      </w:r>
-      <w:proofErr w:type="spellStart"/>
-      <w:r>
-        <w:t>java.io.IOException</w:t>
-      </w:r>
-      <w:proofErr w:type="spellEnd"/>
-      <w:r>
-        <w:t>;</w:t>
-      </w:r>
-    </w:p>
-    <w:p>
-      <w:pPr>
-        <w:pStyle w:val="NoSpacing"/>
-      </w:pPr>
-      <w:proofErr w:type="gramStart"/>
-      <w:r>
-        <w:t>import</w:t>
-      </w:r>
-      <w:proofErr w:type="gramEnd"/>
-      <w:r>
-        <w:t xml:space="preserve"> </w:t>
-      </w:r>
-      <w:proofErr w:type="spellStart"/>
-      <w:r>
-        <w:t>javax.servlet.ServletException</w:t>
-      </w:r>
-      <w:proofErr w:type="spellEnd"/>
-      <w:r>
-        <w:t>;</w:t>
-      </w:r>
-    </w:p>
-    <w:p>
-      <w:pPr>
-        <w:pStyle w:val="NoSpacing"/>
-      </w:pPr>
-      <w:proofErr w:type="gramStart"/>
-      <w:r>
-        <w:t>import</w:t>
-      </w:r>
-      <w:proofErr w:type="gramEnd"/>
-      <w:r>
-        <w:t xml:space="preserve"> </w:t>
-      </w:r>
-      <w:proofErr w:type="spellStart"/>
-      <w:r>
-        <w:t>javax.servlet.http.HttpServlet</w:t>
-      </w:r>
-      <w:proofErr w:type="spellEnd"/>
-      <w:r>
-        <w:t>;</w:t>
-      </w:r>
-    </w:p>
-    <w:p>
-      <w:pPr>
-        <w:pStyle w:val="NoSpacing"/>
-      </w:pPr>
-      <w:proofErr w:type="gramStart"/>
-      <w:r>
-        <w:t>import</w:t>
-      </w:r>
-      <w:proofErr w:type="gramEnd"/>
-      <w:r>
-        <w:t xml:space="preserve"> </w:t>
-      </w:r>
-      <w:proofErr w:type="spellStart"/>
-      <w:r>
-        <w:t>javax.servlet.http.HttpServletRequest</w:t>
-      </w:r>
-      <w:proofErr w:type="spellEnd"/>
-      <w:r>
-        <w:t>;</w:t>
-      </w:r>
-    </w:p>
-    <w:p>
-      <w:pPr>
-        <w:pStyle w:val="NoSpacing"/>
-      </w:pPr>
-      <w:proofErr w:type="gramStart"/>
-      <w:r>
-        <w:t>import</w:t>
-      </w:r>
-      <w:proofErr w:type="gramEnd"/>
-      <w:r>
-        <w:t xml:space="preserve"> </w:t>
-      </w:r>
-      <w:proofErr w:type="spellStart"/>
-      <w:r>
-        <w:t>javax.servlet.http.HttpServletResponse</w:t>
-      </w:r>
-      <w:proofErr w:type="spellEnd"/>
-      <w:r>
-        <w:t>;</w:t>
-      </w:r>
-    </w:p>
-    <w:p>
-      <w:pPr>
-        <w:pStyle w:val="NoSpacing"/>
-      </w:pPr>
-    </w:p>
-    <w:p>
-      <w:pPr>
-        <w:pStyle w:val="NoSpacing"/>
-      </w:pPr>
-      <w:proofErr w:type="gramStart"/>
-      <w:r>
-        <w:t>import</w:t>
-      </w:r>
-      <w:proofErr w:type="gramEnd"/>
-      <w:r>
-        <w:t xml:space="preserve"> </w:t>
-      </w:r>
-      <w:proofErr w:type="spellStart"/>
-      <w:r>
-        <w:t>Model.User</w:t>
-      </w:r>
-      <w:proofErr w:type="spellEnd"/>
-      <w:r>
-        <w:t>;</w:t>
-      </w:r>
-    </w:p>
-    <w:p>
-      <w:pPr>
-        <w:pStyle w:val="NoSpacing"/>
-      </w:pPr>
-      <w:proofErr w:type="gramStart"/>
-      <w:r>
-        <w:t>import</w:t>
-      </w:r>
-      <w:proofErr w:type="gramEnd"/>
-      <w:r>
-        <w:t xml:space="preserve"> </w:t>
-      </w:r>
-      <w:proofErr w:type="spellStart"/>
-      <w:r>
-        <w:t>Repository.UserDAO</w:t>
-      </w:r>
-      <w:proofErr w:type="spellEnd"/>
-      <w:r>
-        <w:t>;</w:t>
-      </w:r>
-    </w:p>
-    <w:p>
-      <w:pPr>
-        <w:pStyle w:val="NoSpacing"/>
-      </w:pPr>
-      <w:proofErr w:type="gramStart"/>
-      <w:r>
-        <w:t>public</w:t>
-      </w:r>
-      <w:proofErr w:type="gramEnd"/>
-      <w:r>
-        <w:t xml:space="preserve"> class Register extends </w:t>
-      </w:r>
-      <w:proofErr w:type="spellStart"/>
-      <w:r>
-        <w:t>HttpServlet</w:t>
-      </w:r>
-      <w:proofErr w:type="spellEnd"/>
-      <w:r>
-        <w:t xml:space="preserve"> {</w:t>
-      </w:r>
-    </w:p>
-    <w:p>
-      <w:pPr>
-        <w:pStyle w:val="NoSpacing"/>
-      </w:pPr>
-      <w:r>
-        <w:tab/>
-      </w:r>
-    </w:p>
-    <w:p>
-      <w:pPr>
-        <w:pStyle w:val="NoSpacing"/>
-      </w:pPr>
-      <w:r>
-        <w:t xml:space="preserve">    </w:t>
-      </w:r>
-    </w:p>
-    <w:p>
-      <w:pPr>
-        <w:pStyle w:val="NoSpacing"/>
-      </w:pPr>
-      <w:r>
-        <w:tab/>
-      </w:r>
-      <w:proofErr w:type="gramStart"/>
-      <w:r>
-        <w:t>protected</w:t>
-      </w:r>
-      <w:proofErr w:type="gramEnd"/>
-      <w:r>
-        <w:t xml:space="preserve"> void </w:t>
-      </w:r>
-      <w:proofErr w:type="spellStart"/>
-      <w:r>
-        <w:t>doPost</w:t>
-      </w:r>
-      <w:proofErr w:type="spellEnd"/>
-      <w:r>
-        <w:t>(</w:t>
-      </w:r>
-      <w:proofErr w:type="spellStart"/>
-      <w:r>
-        <w:t>HttpServletRequest</w:t>
-      </w:r>
-      <w:proofErr w:type="spellEnd"/>
-      <w:r>
-        <w:t xml:space="preserve"> request, </w:t>
-      </w:r>
-      <w:proofErr w:type="spellStart"/>
-      <w:r>
-        <w:t>HttpServletResponse</w:t>
-      </w:r>
-      <w:proofErr w:type="spellEnd"/>
-      <w:r>
-        <w:t xml:space="preserve"> response) throws </w:t>
-      </w:r>
-      <w:proofErr w:type="spellStart"/>
-      <w:r>
-        <w:t>ServletException</w:t>
-      </w:r>
-      <w:proofErr w:type="spellEnd"/>
-      <w:r>
-        <w:t xml:space="preserve">, </w:t>
-      </w:r>
-      <w:proofErr w:type="spellStart"/>
-      <w:r>
-        <w:t>IOException</w:t>
-      </w:r>
-      <w:proofErr w:type="spellEnd"/>
-      <w:r>
-        <w:t xml:space="preserve"> {</w:t>
-      </w:r>
-    </w:p>
-    <w:p>
-      <w:pPr>
-        <w:pStyle w:val="NoSpacing"/>
-      </w:pPr>
-      <w:r>
-        <w:tab/>
-      </w:r>
-      <w:r>
-        <w:tab/>
-        <w:t xml:space="preserve">User user=new </w:t>
-      </w:r>
-      <w:proofErr w:type="gramStart"/>
-      <w:r>
-        <w:t>User(</w:t>
-      </w:r>
-      <w:proofErr w:type="gramEnd"/>
-      <w:r>
-        <w:t>);</w:t>
-      </w:r>
-    </w:p>
-    <w:p>
-      <w:pPr>
-        <w:pStyle w:val="NoSpacing"/>
-      </w:pPr>
-      <w:r>
-        <w:tab/>
-      </w:r>
-      <w:r>
-        <w:tab/>
-      </w:r>
-      <w:proofErr w:type="spellStart"/>
-      <w:proofErr w:type="gramStart"/>
-      <w:r>
-        <w:t>user.setFirstName</w:t>
-      </w:r>
-      <w:proofErr w:type="spellEnd"/>
-      <w:r>
-        <w:t>(</w:t>
-      </w:r>
-      <w:proofErr w:type="spellStart"/>
-      <w:proofErr w:type="gramEnd"/>
-      <w:r>
-        <w:t>request.getParameter</w:t>
-      </w:r>
-      <w:proofErr w:type="spellEnd"/>
-      <w:r>
-        <w:t>("</w:t>
-      </w:r>
-      <w:proofErr w:type="spellStart"/>
-      <w:r>
-        <w:t>firstName</w:t>
-      </w:r>
-      <w:proofErr w:type="spellEnd"/>
-      <w:r>
-        <w:t>"));</w:t>
-      </w:r>
-    </w:p>
-    <w:p>
-      <w:pPr>
-        <w:pStyle w:val="NoSpacing"/>
-      </w:pPr>
-      <w:r>
-        <w:tab/>
-      </w:r>
-      <w:r>
-        <w:tab/>
-      </w:r>
-      <w:proofErr w:type="spellStart"/>
-      <w:proofErr w:type="gramStart"/>
-      <w:r>
-        <w:t>user.setLastName</w:t>
-      </w:r>
-      <w:proofErr w:type="spellEnd"/>
-      <w:r>
-        <w:t>(</w:t>
-      </w:r>
-      <w:proofErr w:type="spellStart"/>
-      <w:proofErr w:type="gramEnd"/>
-      <w:r>
-        <w:t>request.getParameter</w:t>
-      </w:r>
-      <w:proofErr w:type="spellEnd"/>
-      <w:r>
-        <w:t>("</w:t>
-      </w:r>
-      <w:proofErr w:type="spellStart"/>
-      <w:r>
-        <w:t>lastName</w:t>
-      </w:r>
-      <w:proofErr w:type="spellEnd"/>
-      <w:r>
-        <w:t>"));</w:t>
-      </w:r>
-    </w:p>
-    <w:p>
-      <w:pPr>
-        <w:pStyle w:val="NoSpacing"/>
-      </w:pPr>
-      <w:r>
-        <w:tab/>
-      </w:r>
-      <w:r>
-        <w:tab/>
-      </w:r>
-      <w:proofErr w:type="spellStart"/>
-      <w:proofErr w:type="gramStart"/>
-      <w:r>
-        <w:t>user.setUsername</w:t>
-      </w:r>
-      <w:proofErr w:type="spellEnd"/>
-      <w:r>
-        <w:t>(</w:t>
-      </w:r>
-      <w:proofErr w:type="spellStart"/>
-      <w:proofErr w:type="gramEnd"/>
-      <w:r>
-        <w:t>request.getParameter</w:t>
-      </w:r>
-      <w:proofErr w:type="spellEnd"/>
-      <w:r>
-        <w:t>("username"));</w:t>
-      </w:r>
-    </w:p>
-    <w:p>
-      <w:pPr>
-        <w:pStyle w:val="NoSpacing"/>
-      </w:pPr>
-      <w:r>
-        <w:tab/>
-      </w:r>
-      <w:r>
-        <w:tab/>
-      </w:r>
-      <w:proofErr w:type="spellStart"/>
-      <w:proofErr w:type="gramStart"/>
-      <w:r>
-        <w:t>user.setPassword</w:t>
-      </w:r>
-      <w:proofErr w:type="spellEnd"/>
-      <w:r>
-        <w:t>(</w:t>
-      </w:r>
-      <w:proofErr w:type="spellStart"/>
-      <w:proofErr w:type="gramEnd"/>
-      <w:r>
-        <w:t>request.getParameter</w:t>
-      </w:r>
-      <w:proofErr w:type="spellEnd"/>
-      <w:r>
-        <w:t>("password"));</w:t>
-      </w:r>
-    </w:p>
-    <w:p>
-      <w:pPr>
-        <w:pStyle w:val="NoSpacing"/>
-      </w:pPr>
-      <w:r>
-        <w:tab/>
-      </w:r>
-      <w:r>
-        <w:tab/>
-      </w:r>
-      <w:proofErr w:type="spellStart"/>
-      <w:r>
-        <w:t>UserDAO</w:t>
-      </w:r>
-      <w:proofErr w:type="spellEnd"/>
-      <w:r>
-        <w:t xml:space="preserve"> </w:t>
-      </w:r>
-      <w:proofErr w:type="spellStart"/>
-      <w:r>
-        <w:t>dao</w:t>
-      </w:r>
-      <w:proofErr w:type="spellEnd"/>
-      <w:r>
-        <w:t xml:space="preserve">=new </w:t>
-      </w:r>
-      <w:proofErr w:type="spellStart"/>
-      <w:proofErr w:type="gramStart"/>
-      <w:r>
-        <w:t>UserDAO</w:t>
-      </w:r>
-      <w:proofErr w:type="spellEnd"/>
-      <w:r>
-        <w:t>(</w:t>
-      </w:r>
-      <w:proofErr w:type="gramEnd"/>
-      <w:r>
-        <w:t>);</w:t>
-      </w:r>
-    </w:p>
-    <w:p>
-      <w:pPr>
-        <w:pStyle w:val="NoSpacing"/>
-      </w:pPr>
-      <w:r>
-        <w:lastRenderedPageBreak/>
         <w:tab/>
       </w:r>
       <w:r>
@@ -10793,7 +9047,1753 @@
         <w:spacing w:before="0" w:beforeAutospacing="0" w:after="0" w:afterAutospacing="0"/>
         <w:rPr>
           <w:rFonts w:ascii="Consolas" w:hAnsi="Consolas"/>
-          <w:color w:val="008080"/>
+          <w:color w:val="000000"/>
+          <w:sz w:val="28"/>
+          <w:szCs w:val="28"/>
+        </w:rPr>
+      </w:pPr>
+      <w:bookmarkStart w:id="0" w:name="_GoBack"/>
+      <w:bookmarkEnd w:id="0"/>
+    </w:p>
+    <w:p>
+      <w:pPr>
+        <w:rPr>
+          <w:b/>
+          <w:sz w:val="28"/>
+          <w:szCs w:val="28"/>
+        </w:rPr>
+      </w:pPr>
+      <w:r>
+        <w:rPr>
+          <w:b/>
+          <w:sz w:val="28"/>
+          <w:szCs w:val="28"/>
+        </w:rPr>
+        <w:t xml:space="preserve">Create two packages under </w:t>
+      </w:r>
+      <w:proofErr w:type="spellStart"/>
+      <w:r>
+        <w:rPr>
+          <w:b/>
+          <w:sz w:val="28"/>
+          <w:szCs w:val="28"/>
+        </w:rPr>
+        <w:t>src</w:t>
+      </w:r>
+      <w:proofErr w:type="spellEnd"/>
+      <w:r>
+        <w:rPr>
+          <w:b/>
+          <w:sz w:val="28"/>
+          <w:szCs w:val="28"/>
+        </w:rPr>
+        <w:t>/main/java</w:t>
+      </w:r>
+    </w:p>
+    <w:p>
+      <w:pPr>
+        <w:rPr>
+          <w:b/>
+          <w:sz w:val="28"/>
+          <w:szCs w:val="28"/>
+        </w:rPr>
+      </w:pPr>
+      <w:r>
+        <w:rPr>
+          <w:b/>
+          <w:sz w:val="28"/>
+          <w:szCs w:val="28"/>
+        </w:rPr>
+        <w:t xml:space="preserve"> Name them Model and Repository</w:t>
+      </w:r>
+    </w:p>
+    <w:p>
+      <w:pPr>
+        <w:rPr>
+          <w:b/>
+          <w:sz w:val="28"/>
+          <w:szCs w:val="28"/>
+        </w:rPr>
+      </w:pPr>
+      <w:r>
+        <w:rPr>
+          <w:b/>
+          <w:sz w:val="28"/>
+          <w:szCs w:val="28"/>
+        </w:rPr>
+        <w:t xml:space="preserve">All </w:t>
+      </w:r>
+      <w:proofErr w:type="spellStart"/>
+      <w:r>
+        <w:rPr>
+          <w:b/>
+          <w:sz w:val="28"/>
+          <w:szCs w:val="28"/>
+        </w:rPr>
+        <w:t>pojo</w:t>
+      </w:r>
+      <w:proofErr w:type="spellEnd"/>
+      <w:r>
+        <w:rPr>
+          <w:b/>
+          <w:sz w:val="28"/>
+          <w:szCs w:val="28"/>
+        </w:rPr>
+        <w:t xml:space="preserve"> must be created under Model package</w:t>
+      </w:r>
+    </w:p>
+    <w:p>
+      <w:pPr>
+        <w:pStyle w:val="NoSpacing"/>
+      </w:pPr>
+      <w:proofErr w:type="gramStart"/>
+      <w:r>
+        <w:t>package</w:t>
+      </w:r>
+      <w:proofErr w:type="gramEnd"/>
+      <w:r>
+        <w:t xml:space="preserve"> Model;</w:t>
+      </w:r>
+    </w:p>
+    <w:p>
+      <w:pPr>
+        <w:pStyle w:val="NoSpacing"/>
+      </w:pPr>
+      <w:proofErr w:type="gramStart"/>
+      <w:r>
+        <w:t>import</w:t>
+      </w:r>
+      <w:proofErr w:type="gramEnd"/>
+      <w:r>
+        <w:t xml:space="preserve"> </w:t>
+      </w:r>
+      <w:proofErr w:type="spellStart"/>
+      <w:r>
+        <w:t>java.io.Serializable</w:t>
+      </w:r>
+      <w:proofErr w:type="spellEnd"/>
+      <w:r>
+        <w:t>;</w:t>
+      </w:r>
+    </w:p>
+    <w:p>
+      <w:pPr>
+        <w:pStyle w:val="NoSpacing"/>
+      </w:pPr>
+    </w:p>
+    <w:p>
+      <w:pPr>
+        <w:pStyle w:val="NoSpacing"/>
+      </w:pPr>
+      <w:proofErr w:type="gramStart"/>
+      <w:r>
+        <w:t>import</w:t>
+      </w:r>
+      <w:proofErr w:type="gramEnd"/>
+      <w:r>
+        <w:t xml:space="preserve"> </w:t>
+      </w:r>
+      <w:proofErr w:type="spellStart"/>
+      <w:r>
+        <w:t>javax.persistence.Column</w:t>
+      </w:r>
+      <w:proofErr w:type="spellEnd"/>
+      <w:r>
+        <w:t>;</w:t>
+      </w:r>
+    </w:p>
+    <w:p>
+      <w:pPr>
+        <w:pStyle w:val="NoSpacing"/>
+      </w:pPr>
+      <w:proofErr w:type="gramStart"/>
+      <w:r>
+        <w:t>import</w:t>
+      </w:r>
+      <w:proofErr w:type="gramEnd"/>
+      <w:r>
+        <w:t xml:space="preserve"> </w:t>
+      </w:r>
+      <w:proofErr w:type="spellStart"/>
+      <w:r>
+        <w:t>javax.persistence.Entity</w:t>
+      </w:r>
+      <w:proofErr w:type="spellEnd"/>
+      <w:r>
+        <w:t>;</w:t>
+      </w:r>
+    </w:p>
+    <w:p>
+      <w:pPr>
+        <w:pStyle w:val="NoSpacing"/>
+      </w:pPr>
+      <w:proofErr w:type="gramStart"/>
+      <w:r>
+        <w:t>import</w:t>
+      </w:r>
+      <w:proofErr w:type="gramEnd"/>
+      <w:r>
+        <w:t xml:space="preserve"> </w:t>
+      </w:r>
+      <w:proofErr w:type="spellStart"/>
+      <w:r>
+        <w:t>javax.persistence.GeneratedValue</w:t>
+      </w:r>
+      <w:proofErr w:type="spellEnd"/>
+      <w:r>
+        <w:t>;</w:t>
+      </w:r>
+    </w:p>
+    <w:p>
+      <w:pPr>
+        <w:pStyle w:val="NoSpacing"/>
+      </w:pPr>
+      <w:proofErr w:type="gramStart"/>
+      <w:r>
+        <w:t>import</w:t>
+      </w:r>
+      <w:proofErr w:type="gramEnd"/>
+      <w:r>
+        <w:t xml:space="preserve"> </w:t>
+      </w:r>
+      <w:proofErr w:type="spellStart"/>
+      <w:r>
+        <w:t>javax.persistence.GenerationType</w:t>
+      </w:r>
+      <w:proofErr w:type="spellEnd"/>
+      <w:r>
+        <w:t>;</w:t>
+      </w:r>
+    </w:p>
+    <w:p>
+      <w:pPr>
+        <w:pStyle w:val="NoSpacing"/>
+      </w:pPr>
+      <w:proofErr w:type="gramStart"/>
+      <w:r>
+        <w:t>import</w:t>
+      </w:r>
+      <w:proofErr w:type="gramEnd"/>
+      <w:r>
+        <w:t xml:space="preserve"> </w:t>
+      </w:r>
+      <w:proofErr w:type="spellStart"/>
+      <w:r>
+        <w:t>javax.persistence.Id</w:t>
+      </w:r>
+      <w:proofErr w:type="spellEnd"/>
+      <w:r>
+        <w:t>;</w:t>
+      </w:r>
+    </w:p>
+    <w:p>
+      <w:pPr>
+        <w:pStyle w:val="NoSpacing"/>
+      </w:pPr>
+    </w:p>
+    <w:p>
+      <w:pPr>
+        <w:pStyle w:val="NoSpacing"/>
+      </w:pPr>
+      <w:r>
+        <w:t>@Entity</w:t>
+      </w:r>
+    </w:p>
+    <w:p>
+      <w:pPr>
+        <w:pStyle w:val="NoSpacing"/>
+      </w:pPr>
+      <w:proofErr w:type="gramStart"/>
+      <w:r>
+        <w:t>public</w:t>
+      </w:r>
+      <w:proofErr w:type="gramEnd"/>
+      <w:r>
+        <w:t xml:space="preserve"> class User implements Serializable {</w:t>
+      </w:r>
+    </w:p>
+    <w:p>
+      <w:pPr>
+        <w:pStyle w:val="NoSpacing"/>
+      </w:pPr>
+      <w:r>
+        <w:tab/>
+      </w:r>
+    </w:p>
+    <w:p>
+      <w:pPr>
+        <w:pStyle w:val="NoSpacing"/>
+      </w:pPr>
+      <w:r>
+        <w:t xml:space="preserve">    @Id</w:t>
+      </w:r>
+    </w:p>
+    <w:p>
+      <w:pPr>
+        <w:pStyle w:val="NoSpacing"/>
+      </w:pPr>
+      <w:r>
+        <w:t xml:space="preserve">    </w:t>
+      </w:r>
+      <w:proofErr w:type="gramStart"/>
+      <w:r>
+        <w:t>@</w:t>
+      </w:r>
+      <w:proofErr w:type="spellStart"/>
+      <w:r>
+        <w:t>GeneratedValue</w:t>
+      </w:r>
+      <w:proofErr w:type="spellEnd"/>
+      <w:r>
+        <w:t>(</w:t>
+      </w:r>
+      <w:proofErr w:type="gramEnd"/>
+      <w:r>
+        <w:t xml:space="preserve">strategy = </w:t>
+      </w:r>
+      <w:proofErr w:type="spellStart"/>
+      <w:r>
+        <w:t>GenerationType.AUTO</w:t>
+      </w:r>
+      <w:proofErr w:type="spellEnd"/>
+      <w:r>
+        <w:t>)</w:t>
+      </w:r>
+    </w:p>
+    <w:p>
+      <w:pPr>
+        <w:pStyle w:val="NoSpacing"/>
+      </w:pPr>
+      <w:r>
+        <w:t xml:space="preserve">    </w:t>
+      </w:r>
+      <w:proofErr w:type="gramStart"/>
+      <w:r>
+        <w:t>private</w:t>
+      </w:r>
+      <w:proofErr w:type="gramEnd"/>
+      <w:r>
+        <w:t xml:space="preserve"> </w:t>
+      </w:r>
+      <w:proofErr w:type="spellStart"/>
+      <w:r>
+        <w:t>int</w:t>
+      </w:r>
+      <w:proofErr w:type="spellEnd"/>
+      <w:r>
+        <w:t xml:space="preserve"> id;</w:t>
+      </w:r>
+    </w:p>
+    <w:p>
+      <w:pPr>
+        <w:pStyle w:val="NoSpacing"/>
+      </w:pPr>
+    </w:p>
+    <w:p>
+      <w:pPr>
+        <w:pStyle w:val="NoSpacing"/>
+      </w:pPr>
+      <w:r>
+        <w:t xml:space="preserve">    @Column</w:t>
+      </w:r>
+    </w:p>
+    <w:p>
+      <w:pPr>
+        <w:pStyle w:val="NoSpacing"/>
+      </w:pPr>
+      <w:r>
+        <w:t xml:space="preserve">    </w:t>
+      </w:r>
+      <w:proofErr w:type="gramStart"/>
+      <w:r>
+        <w:t>private</w:t>
+      </w:r>
+      <w:proofErr w:type="gramEnd"/>
+      <w:r>
+        <w:t xml:space="preserve"> String </w:t>
+      </w:r>
+      <w:proofErr w:type="spellStart"/>
+      <w:r>
+        <w:t>firstName</w:t>
+      </w:r>
+      <w:proofErr w:type="spellEnd"/>
+      <w:r>
+        <w:t>;</w:t>
+      </w:r>
+    </w:p>
+    <w:p>
+      <w:pPr>
+        <w:pStyle w:val="NoSpacing"/>
+      </w:pPr>
+    </w:p>
+    <w:p>
+      <w:pPr>
+        <w:pStyle w:val="NoSpacing"/>
+      </w:pPr>
+      <w:r>
+        <w:t xml:space="preserve">    @Column</w:t>
+      </w:r>
+    </w:p>
+    <w:p>
+      <w:pPr>
+        <w:pStyle w:val="NoSpacing"/>
+      </w:pPr>
+      <w:r>
+        <w:t xml:space="preserve">    </w:t>
+      </w:r>
+      <w:proofErr w:type="gramStart"/>
+      <w:r>
+        <w:t>private</w:t>
+      </w:r>
+      <w:proofErr w:type="gramEnd"/>
+      <w:r>
+        <w:t xml:space="preserve"> String </w:t>
+      </w:r>
+      <w:proofErr w:type="spellStart"/>
+      <w:r>
+        <w:t>lastName</w:t>
+      </w:r>
+      <w:proofErr w:type="spellEnd"/>
+      <w:r>
+        <w:t>;</w:t>
+      </w:r>
+    </w:p>
+    <w:p>
+      <w:pPr>
+        <w:pStyle w:val="NoSpacing"/>
+      </w:pPr>
+    </w:p>
+    <w:p>
+      <w:pPr>
+        <w:pStyle w:val="NoSpacing"/>
+      </w:pPr>
+      <w:r>
+        <w:t xml:space="preserve">    @Column</w:t>
+      </w:r>
+    </w:p>
+    <w:p>
+      <w:pPr>
+        <w:pStyle w:val="NoSpacing"/>
+      </w:pPr>
+      <w:r>
+        <w:t xml:space="preserve">    </w:t>
+      </w:r>
+      <w:proofErr w:type="gramStart"/>
+      <w:r>
+        <w:t>private</w:t>
+      </w:r>
+      <w:proofErr w:type="gramEnd"/>
+      <w:r>
+        <w:t xml:space="preserve"> String username;</w:t>
+      </w:r>
+    </w:p>
+    <w:p>
+      <w:pPr>
+        <w:pStyle w:val="NoSpacing"/>
+      </w:pPr>
+    </w:p>
+    <w:p>
+      <w:pPr>
+        <w:pStyle w:val="NoSpacing"/>
+      </w:pPr>
+      <w:r>
+        <w:t xml:space="preserve">    @Column</w:t>
+      </w:r>
+    </w:p>
+    <w:p>
+      <w:pPr>
+        <w:pStyle w:val="NoSpacing"/>
+      </w:pPr>
+      <w:r>
+        <w:t xml:space="preserve">    </w:t>
+      </w:r>
+      <w:proofErr w:type="gramStart"/>
+      <w:r>
+        <w:t>private</w:t>
+      </w:r>
+      <w:proofErr w:type="gramEnd"/>
+      <w:r>
+        <w:t xml:space="preserve"> String password;</w:t>
+      </w:r>
+    </w:p>
+    <w:p>
+      <w:pPr>
+        <w:pStyle w:val="NoSpacing"/>
+      </w:pPr>
+    </w:p>
+    <w:p>
+      <w:pPr>
+        <w:pStyle w:val="NoSpacing"/>
+      </w:pPr>
+      <w:r>
+        <w:t xml:space="preserve">    </w:t>
+      </w:r>
+      <w:proofErr w:type="gramStart"/>
+      <w:r>
+        <w:t>public</w:t>
+      </w:r>
+      <w:proofErr w:type="gramEnd"/>
+      <w:r>
+        <w:t xml:space="preserve"> String </w:t>
+      </w:r>
+      <w:proofErr w:type="spellStart"/>
+      <w:r>
+        <w:t>getFirstName</w:t>
+      </w:r>
+      <w:proofErr w:type="spellEnd"/>
+      <w:r>
+        <w:t>() {</w:t>
+      </w:r>
+    </w:p>
+    <w:p>
+      <w:pPr>
+        <w:pStyle w:val="NoSpacing"/>
+      </w:pPr>
+      <w:r>
+        <w:t xml:space="preserve">        </w:t>
+      </w:r>
+      <w:proofErr w:type="gramStart"/>
+      <w:r>
+        <w:t>return</w:t>
+      </w:r>
+      <w:proofErr w:type="gramEnd"/>
+      <w:r>
+        <w:t xml:space="preserve"> </w:t>
+      </w:r>
+      <w:proofErr w:type="spellStart"/>
+      <w:r>
+        <w:t>firstName</w:t>
+      </w:r>
+      <w:proofErr w:type="spellEnd"/>
+      <w:r>
+        <w:t>;</w:t>
+      </w:r>
+    </w:p>
+    <w:p>
+      <w:pPr>
+        <w:pStyle w:val="NoSpacing"/>
+      </w:pPr>
+      <w:r>
+        <w:t xml:space="preserve">    }</w:t>
+      </w:r>
+    </w:p>
+    <w:p>
+      <w:pPr>
+        <w:pStyle w:val="NoSpacing"/>
+      </w:pPr>
+      <w:r>
+        <w:t xml:space="preserve">    </w:t>
+      </w:r>
+      <w:proofErr w:type="gramStart"/>
+      <w:r>
+        <w:t>public</w:t>
+      </w:r>
+      <w:proofErr w:type="gramEnd"/>
+      <w:r>
+        <w:t xml:space="preserve"> void </w:t>
+      </w:r>
+      <w:proofErr w:type="spellStart"/>
+      <w:r>
+        <w:t>setFirstName</w:t>
+      </w:r>
+      <w:proofErr w:type="spellEnd"/>
+      <w:r>
+        <w:t xml:space="preserve">(String </w:t>
+      </w:r>
+      <w:proofErr w:type="spellStart"/>
+      <w:r>
+        <w:t>firstName</w:t>
+      </w:r>
+      <w:proofErr w:type="spellEnd"/>
+      <w:r>
+        <w:t>) {</w:t>
+      </w:r>
+    </w:p>
+    <w:p>
+      <w:pPr>
+        <w:pStyle w:val="NoSpacing"/>
+      </w:pPr>
+      <w:r>
+        <w:t xml:space="preserve">        </w:t>
+      </w:r>
+      <w:proofErr w:type="spellStart"/>
+      <w:r>
+        <w:t>this.firstName</w:t>
+      </w:r>
+      <w:proofErr w:type="spellEnd"/>
+      <w:r>
+        <w:t xml:space="preserve"> = </w:t>
+      </w:r>
+      <w:proofErr w:type="spellStart"/>
+      <w:r>
+        <w:t>firstName</w:t>
+      </w:r>
+      <w:proofErr w:type="spellEnd"/>
+      <w:r>
+        <w:t>;</w:t>
+      </w:r>
+    </w:p>
+    <w:p>
+      <w:pPr>
+        <w:pStyle w:val="NoSpacing"/>
+      </w:pPr>
+      <w:r>
+        <w:t xml:space="preserve">    }</w:t>
+      </w:r>
+    </w:p>
+    <w:p>
+      <w:pPr>
+        <w:pStyle w:val="NoSpacing"/>
+      </w:pPr>
+      <w:r>
+        <w:t xml:space="preserve">    </w:t>
+      </w:r>
+      <w:proofErr w:type="gramStart"/>
+      <w:r>
+        <w:t>public</w:t>
+      </w:r>
+      <w:proofErr w:type="gramEnd"/>
+      <w:r>
+        <w:t xml:space="preserve"> String </w:t>
+      </w:r>
+      <w:proofErr w:type="spellStart"/>
+      <w:r>
+        <w:t>getLastName</w:t>
+      </w:r>
+      <w:proofErr w:type="spellEnd"/>
+      <w:r>
+        <w:t>() {</w:t>
+      </w:r>
+    </w:p>
+    <w:p>
+      <w:pPr>
+        <w:pStyle w:val="NoSpacing"/>
+      </w:pPr>
+      <w:r>
+        <w:t xml:space="preserve">        </w:t>
+      </w:r>
+      <w:proofErr w:type="gramStart"/>
+      <w:r>
+        <w:t>return</w:t>
+      </w:r>
+      <w:proofErr w:type="gramEnd"/>
+      <w:r>
+        <w:t xml:space="preserve"> </w:t>
+      </w:r>
+      <w:proofErr w:type="spellStart"/>
+      <w:r>
+        <w:t>lastName</w:t>
+      </w:r>
+      <w:proofErr w:type="spellEnd"/>
+      <w:r>
+        <w:t>;</w:t>
+      </w:r>
+    </w:p>
+    <w:p>
+      <w:pPr>
+        <w:pStyle w:val="NoSpacing"/>
+      </w:pPr>
+      <w:r>
+        <w:t xml:space="preserve">    }</w:t>
+      </w:r>
+    </w:p>
+    <w:p>
+      <w:pPr>
+        <w:pStyle w:val="NoSpacing"/>
+      </w:pPr>
+      <w:r>
+        <w:t xml:space="preserve">    </w:t>
+      </w:r>
+      <w:proofErr w:type="gramStart"/>
+      <w:r>
+        <w:t>public</w:t>
+      </w:r>
+      <w:proofErr w:type="gramEnd"/>
+      <w:r>
+        <w:t xml:space="preserve"> void </w:t>
+      </w:r>
+      <w:proofErr w:type="spellStart"/>
+      <w:r>
+        <w:t>setLastName</w:t>
+      </w:r>
+      <w:proofErr w:type="spellEnd"/>
+      <w:r>
+        <w:t xml:space="preserve">(String </w:t>
+      </w:r>
+      <w:proofErr w:type="spellStart"/>
+      <w:r>
+        <w:t>lastName</w:t>
+      </w:r>
+      <w:proofErr w:type="spellEnd"/>
+      <w:r>
+        <w:t>) {</w:t>
+      </w:r>
+    </w:p>
+    <w:p>
+      <w:pPr>
+        <w:pStyle w:val="NoSpacing"/>
+      </w:pPr>
+      <w:r>
+        <w:t xml:space="preserve">        </w:t>
+      </w:r>
+      <w:proofErr w:type="spellStart"/>
+      <w:r>
+        <w:t>this.lastName</w:t>
+      </w:r>
+      <w:proofErr w:type="spellEnd"/>
+      <w:r>
+        <w:t xml:space="preserve"> = </w:t>
+      </w:r>
+      <w:proofErr w:type="spellStart"/>
+      <w:r>
+        <w:t>lastName</w:t>
+      </w:r>
+      <w:proofErr w:type="spellEnd"/>
+      <w:r>
+        <w:t>;</w:t>
+      </w:r>
+    </w:p>
+    <w:p>
+      <w:pPr>
+        <w:pStyle w:val="NoSpacing"/>
+      </w:pPr>
+      <w:r>
+        <w:t xml:space="preserve">    }</w:t>
+      </w:r>
+    </w:p>
+    <w:p>
+      <w:pPr>
+        <w:pStyle w:val="NoSpacing"/>
+      </w:pPr>
+      <w:r>
+        <w:t xml:space="preserve">    </w:t>
+      </w:r>
+      <w:proofErr w:type="gramStart"/>
+      <w:r>
+        <w:t>public</w:t>
+      </w:r>
+      <w:proofErr w:type="gramEnd"/>
+      <w:r>
+        <w:t xml:space="preserve"> String </w:t>
+      </w:r>
+      <w:proofErr w:type="spellStart"/>
+      <w:r>
+        <w:t>getUsername</w:t>
+      </w:r>
+      <w:proofErr w:type="spellEnd"/>
+      <w:r>
+        <w:t>() {</w:t>
+      </w:r>
+    </w:p>
+    <w:p>
+      <w:pPr>
+        <w:pStyle w:val="NoSpacing"/>
+      </w:pPr>
+      <w:r>
+        <w:t xml:space="preserve">        </w:t>
+      </w:r>
+      <w:proofErr w:type="gramStart"/>
+      <w:r>
+        <w:t>return</w:t>
+      </w:r>
+      <w:proofErr w:type="gramEnd"/>
+      <w:r>
+        <w:t xml:space="preserve"> username;</w:t>
+      </w:r>
+    </w:p>
+    <w:p>
+      <w:pPr>
+        <w:pStyle w:val="NoSpacing"/>
+      </w:pPr>
+      <w:r>
+        <w:t xml:space="preserve">    }</w:t>
+      </w:r>
+    </w:p>
+    <w:p>
+      <w:pPr>
+        <w:pStyle w:val="NoSpacing"/>
+      </w:pPr>
+      <w:r>
+        <w:t xml:space="preserve">    </w:t>
+      </w:r>
+      <w:proofErr w:type="gramStart"/>
+      <w:r>
+        <w:t>public</w:t>
+      </w:r>
+      <w:proofErr w:type="gramEnd"/>
+      <w:r>
+        <w:t xml:space="preserve"> void </w:t>
+      </w:r>
+      <w:proofErr w:type="spellStart"/>
+      <w:r>
+        <w:t>setUsername</w:t>
+      </w:r>
+      <w:proofErr w:type="spellEnd"/>
+      <w:r>
+        <w:t>(String username) {</w:t>
+      </w:r>
+    </w:p>
+    <w:p>
+      <w:pPr>
+        <w:pStyle w:val="NoSpacing"/>
+      </w:pPr>
+      <w:r>
+        <w:lastRenderedPageBreak/>
+        <w:t xml:space="preserve">        </w:t>
+      </w:r>
+      <w:proofErr w:type="spellStart"/>
+      <w:r>
+        <w:t>this.username</w:t>
+      </w:r>
+      <w:proofErr w:type="spellEnd"/>
+      <w:r>
+        <w:t xml:space="preserve"> = username;</w:t>
+      </w:r>
+    </w:p>
+    <w:p>
+      <w:pPr>
+        <w:pStyle w:val="NoSpacing"/>
+      </w:pPr>
+      <w:r>
+        <w:t xml:space="preserve">    }</w:t>
+      </w:r>
+    </w:p>
+    <w:p>
+      <w:pPr>
+        <w:pStyle w:val="NoSpacing"/>
+      </w:pPr>
+      <w:r>
+        <w:t xml:space="preserve">    </w:t>
+      </w:r>
+      <w:proofErr w:type="gramStart"/>
+      <w:r>
+        <w:t>public</w:t>
+      </w:r>
+      <w:proofErr w:type="gramEnd"/>
+      <w:r>
+        <w:t xml:space="preserve"> String </w:t>
+      </w:r>
+      <w:proofErr w:type="spellStart"/>
+      <w:r>
+        <w:t>getPassword</w:t>
+      </w:r>
+      <w:proofErr w:type="spellEnd"/>
+      <w:r>
+        <w:t>() {</w:t>
+      </w:r>
+    </w:p>
+    <w:p>
+      <w:pPr>
+        <w:pStyle w:val="NoSpacing"/>
+      </w:pPr>
+      <w:r>
+        <w:t xml:space="preserve">        </w:t>
+      </w:r>
+      <w:proofErr w:type="gramStart"/>
+      <w:r>
+        <w:t>return</w:t>
+      </w:r>
+      <w:proofErr w:type="gramEnd"/>
+      <w:r>
+        <w:t xml:space="preserve"> password;</w:t>
+      </w:r>
+    </w:p>
+    <w:p>
+      <w:pPr>
+        <w:pStyle w:val="NoSpacing"/>
+      </w:pPr>
+      <w:r>
+        <w:t xml:space="preserve">    }</w:t>
+      </w:r>
+    </w:p>
+    <w:p>
+      <w:pPr>
+        <w:pStyle w:val="NoSpacing"/>
+      </w:pPr>
+      <w:r>
+        <w:t xml:space="preserve">    </w:t>
+      </w:r>
+      <w:proofErr w:type="gramStart"/>
+      <w:r>
+        <w:t>public</w:t>
+      </w:r>
+      <w:proofErr w:type="gramEnd"/>
+      <w:r>
+        <w:t xml:space="preserve"> void </w:t>
+      </w:r>
+      <w:proofErr w:type="spellStart"/>
+      <w:r>
+        <w:t>setPassword</w:t>
+      </w:r>
+      <w:proofErr w:type="spellEnd"/>
+      <w:r>
+        <w:t>(String password) {</w:t>
+      </w:r>
+    </w:p>
+    <w:p>
+      <w:pPr>
+        <w:pStyle w:val="NoSpacing"/>
+      </w:pPr>
+      <w:r>
+        <w:t xml:space="preserve">        </w:t>
+      </w:r>
+      <w:proofErr w:type="spellStart"/>
+      <w:r>
+        <w:t>this.password</w:t>
+      </w:r>
+      <w:proofErr w:type="spellEnd"/>
+      <w:r>
+        <w:t xml:space="preserve"> = password;</w:t>
+      </w:r>
+    </w:p>
+    <w:p>
+      <w:pPr>
+        <w:pStyle w:val="NoSpacing"/>
+      </w:pPr>
+      <w:r>
+        <w:t xml:space="preserve">    }</w:t>
+      </w:r>
+    </w:p>
+    <w:p>
+      <w:pPr>
+        <w:pStyle w:val="NoSpacing"/>
+      </w:pPr>
+      <w:r>
+        <w:tab/>
+      </w:r>
+      <w:proofErr w:type="gramStart"/>
+      <w:r>
+        <w:t>public</w:t>
+      </w:r>
+      <w:proofErr w:type="gramEnd"/>
+      <w:r>
+        <w:t xml:space="preserve"> User(</w:t>
+      </w:r>
+      <w:proofErr w:type="spellStart"/>
+      <w:r>
+        <w:t>int</w:t>
+      </w:r>
+      <w:proofErr w:type="spellEnd"/>
+      <w:r>
+        <w:t xml:space="preserve"> id, String </w:t>
+      </w:r>
+      <w:proofErr w:type="spellStart"/>
+      <w:r>
+        <w:t>firstName</w:t>
+      </w:r>
+      <w:proofErr w:type="spellEnd"/>
+      <w:r>
+        <w:t xml:space="preserve">, String </w:t>
+      </w:r>
+      <w:proofErr w:type="spellStart"/>
+      <w:r>
+        <w:t>lastName</w:t>
+      </w:r>
+      <w:proofErr w:type="spellEnd"/>
+      <w:r>
+        <w:t>, String username, String password) {</w:t>
+      </w:r>
+    </w:p>
+    <w:p>
+      <w:pPr>
+        <w:pStyle w:val="NoSpacing"/>
+      </w:pPr>
+      <w:r>
+        <w:tab/>
+      </w:r>
+      <w:r>
+        <w:tab/>
+      </w:r>
+      <w:proofErr w:type="gramStart"/>
+      <w:r>
+        <w:t>super(</w:t>
+      </w:r>
+      <w:proofErr w:type="gramEnd"/>
+      <w:r>
+        <w:t>);</w:t>
+      </w:r>
+    </w:p>
+    <w:p>
+      <w:pPr>
+        <w:pStyle w:val="NoSpacing"/>
+      </w:pPr>
+      <w:r>
+        <w:tab/>
+      </w:r>
+      <w:r>
+        <w:tab/>
+        <w:t>this.id = id;</w:t>
+      </w:r>
+    </w:p>
+    <w:p>
+      <w:pPr>
+        <w:pStyle w:val="NoSpacing"/>
+      </w:pPr>
+      <w:r>
+        <w:tab/>
+      </w:r>
+      <w:r>
+        <w:tab/>
+      </w:r>
+      <w:proofErr w:type="spellStart"/>
+      <w:r>
+        <w:t>this.firstName</w:t>
+      </w:r>
+      <w:proofErr w:type="spellEnd"/>
+      <w:r>
+        <w:t xml:space="preserve"> = </w:t>
+      </w:r>
+      <w:proofErr w:type="spellStart"/>
+      <w:r>
+        <w:t>firstName</w:t>
+      </w:r>
+      <w:proofErr w:type="spellEnd"/>
+      <w:r>
+        <w:t>;</w:t>
+      </w:r>
+    </w:p>
+    <w:p>
+      <w:pPr>
+        <w:pStyle w:val="NoSpacing"/>
+      </w:pPr>
+      <w:r>
+        <w:tab/>
+      </w:r>
+      <w:r>
+        <w:tab/>
+      </w:r>
+      <w:proofErr w:type="spellStart"/>
+      <w:r>
+        <w:t>this.lastName</w:t>
+      </w:r>
+      <w:proofErr w:type="spellEnd"/>
+      <w:r>
+        <w:t xml:space="preserve"> = </w:t>
+      </w:r>
+      <w:proofErr w:type="spellStart"/>
+      <w:r>
+        <w:t>lastName</w:t>
+      </w:r>
+      <w:proofErr w:type="spellEnd"/>
+      <w:r>
+        <w:t>;</w:t>
+      </w:r>
+    </w:p>
+    <w:p>
+      <w:pPr>
+        <w:pStyle w:val="NoSpacing"/>
+      </w:pPr>
+      <w:r>
+        <w:tab/>
+      </w:r>
+      <w:r>
+        <w:tab/>
+      </w:r>
+      <w:proofErr w:type="spellStart"/>
+      <w:r>
+        <w:t>this.username</w:t>
+      </w:r>
+      <w:proofErr w:type="spellEnd"/>
+      <w:r>
+        <w:t xml:space="preserve"> = username;</w:t>
+      </w:r>
+    </w:p>
+    <w:p>
+      <w:pPr>
+        <w:pStyle w:val="NoSpacing"/>
+      </w:pPr>
+      <w:r>
+        <w:tab/>
+      </w:r>
+      <w:r>
+        <w:tab/>
+      </w:r>
+      <w:proofErr w:type="spellStart"/>
+      <w:r>
+        <w:t>this.password</w:t>
+      </w:r>
+      <w:proofErr w:type="spellEnd"/>
+      <w:r>
+        <w:t xml:space="preserve"> = password;</w:t>
+      </w:r>
+    </w:p>
+    <w:p>
+      <w:pPr>
+        <w:pStyle w:val="NoSpacing"/>
+      </w:pPr>
+      <w:r>
+        <w:tab/>
+        <w:t>}</w:t>
+      </w:r>
+    </w:p>
+    <w:p>
+      <w:pPr>
+        <w:pStyle w:val="NoSpacing"/>
+      </w:pPr>
+      <w:r>
+        <w:tab/>
+      </w:r>
+      <w:proofErr w:type="gramStart"/>
+      <w:r>
+        <w:t>public</w:t>
+      </w:r>
+      <w:proofErr w:type="gramEnd"/>
+      <w:r>
+        <w:t xml:space="preserve"> User() {</w:t>
+      </w:r>
+    </w:p>
+    <w:p>
+      <w:pPr>
+        <w:pStyle w:val="NoSpacing"/>
+      </w:pPr>
+      <w:r>
+        <w:tab/>
+      </w:r>
+      <w:r>
+        <w:tab/>
+      </w:r>
+      <w:proofErr w:type="gramStart"/>
+      <w:r>
+        <w:t>super(</w:t>
+      </w:r>
+      <w:proofErr w:type="gramEnd"/>
+      <w:r>
+        <w:t>);</w:t>
+      </w:r>
+    </w:p>
+    <w:p>
+      <w:pPr>
+        <w:pStyle w:val="NoSpacing"/>
+      </w:pPr>
+      <w:r>
+        <w:tab/>
+        <w:t>}</w:t>
+      </w:r>
+    </w:p>
+    <w:p>
+      <w:pPr>
+        <w:pStyle w:val="NoSpacing"/>
+      </w:pPr>
+      <w:r>
+        <w:t xml:space="preserve">    </w:t>
+      </w:r>
+    </w:p>
+    <w:p>
+      <w:pPr>
+        <w:pStyle w:val="NoSpacing"/>
+      </w:pPr>
+      <w:r>
+        <w:t>}</w:t>
+      </w:r>
+    </w:p>
+    <w:p>
+      <w:pPr>
+        <w:pStyle w:val="NoSpacing"/>
+      </w:pPr>
+    </w:p>
+    <w:p>
+      <w:pPr>
+        <w:rPr>
+          <w:b/>
+          <w:sz w:val="28"/>
+          <w:szCs w:val="28"/>
+        </w:rPr>
+      </w:pPr>
+      <w:r>
+        <w:rPr>
+          <w:b/>
+          <w:sz w:val="28"/>
+          <w:szCs w:val="28"/>
+        </w:rPr>
+        <w:t>All DAO must be under Repository package</w:t>
+      </w:r>
+    </w:p>
+    <w:p>
+      <w:pPr>
+        <w:pStyle w:val="NoSpacing"/>
+      </w:pPr>
+      <w:proofErr w:type="gramStart"/>
+      <w:r>
+        <w:t>package</w:t>
+      </w:r>
+      <w:proofErr w:type="gramEnd"/>
+      <w:r>
+        <w:t xml:space="preserve"> Repository;</w:t>
+      </w:r>
+    </w:p>
+    <w:p>
+      <w:pPr>
+        <w:pStyle w:val="NoSpacing"/>
+      </w:pPr>
+      <w:proofErr w:type="gramStart"/>
+      <w:r>
+        <w:t>import</w:t>
+      </w:r>
+      <w:proofErr w:type="gramEnd"/>
+      <w:r>
+        <w:t xml:space="preserve"> </w:t>
+      </w:r>
+      <w:proofErr w:type="spellStart"/>
+      <w:r>
+        <w:t>java.util.List</w:t>
+      </w:r>
+      <w:proofErr w:type="spellEnd"/>
+      <w:r>
+        <w:t>;</w:t>
+      </w:r>
+    </w:p>
+    <w:p>
+      <w:pPr>
+        <w:pStyle w:val="NoSpacing"/>
+      </w:pPr>
+    </w:p>
+    <w:p>
+      <w:pPr>
+        <w:pStyle w:val="NoSpacing"/>
+      </w:pPr>
+      <w:proofErr w:type="gramStart"/>
+      <w:r>
+        <w:t>import</w:t>
+      </w:r>
+      <w:proofErr w:type="gramEnd"/>
+      <w:r>
+        <w:t xml:space="preserve"> </w:t>
+      </w:r>
+      <w:proofErr w:type="spellStart"/>
+      <w:r>
+        <w:t>org.hibernate.Session</w:t>
+      </w:r>
+      <w:proofErr w:type="spellEnd"/>
+      <w:r>
+        <w:t>;</w:t>
+      </w:r>
+    </w:p>
+    <w:p>
+      <w:pPr>
+        <w:pStyle w:val="NoSpacing"/>
+      </w:pPr>
+      <w:proofErr w:type="gramStart"/>
+      <w:r>
+        <w:t>import</w:t>
+      </w:r>
+      <w:proofErr w:type="gramEnd"/>
+      <w:r>
+        <w:t xml:space="preserve"> </w:t>
+      </w:r>
+      <w:proofErr w:type="spellStart"/>
+      <w:r>
+        <w:t>org.hibernate.SessionFactory</w:t>
+      </w:r>
+      <w:proofErr w:type="spellEnd"/>
+      <w:r>
+        <w:t>;</w:t>
+      </w:r>
+    </w:p>
+    <w:p>
+      <w:pPr>
+        <w:pStyle w:val="NoSpacing"/>
+      </w:pPr>
+      <w:proofErr w:type="gramStart"/>
+      <w:r>
+        <w:t>import</w:t>
+      </w:r>
+      <w:proofErr w:type="gramEnd"/>
+      <w:r>
+        <w:t xml:space="preserve"> </w:t>
+      </w:r>
+      <w:proofErr w:type="spellStart"/>
+      <w:r>
+        <w:t>org.hibernate.Transaction</w:t>
+      </w:r>
+      <w:proofErr w:type="spellEnd"/>
+      <w:r>
+        <w:t>;</w:t>
+      </w:r>
+    </w:p>
+    <w:p>
+      <w:pPr>
+        <w:pStyle w:val="NoSpacing"/>
+      </w:pPr>
+      <w:proofErr w:type="gramStart"/>
+      <w:r>
+        <w:t>import</w:t>
+      </w:r>
+      <w:proofErr w:type="gramEnd"/>
+      <w:r>
+        <w:t xml:space="preserve"> </w:t>
+      </w:r>
+      <w:proofErr w:type="spellStart"/>
+      <w:r>
+        <w:t>org.hibernate.cfg.Configuration</w:t>
+      </w:r>
+      <w:proofErr w:type="spellEnd"/>
+      <w:r>
+        <w:t>;</w:t>
+      </w:r>
+    </w:p>
+    <w:p>
+      <w:pPr>
+        <w:pStyle w:val="NoSpacing"/>
+      </w:pPr>
+    </w:p>
+    <w:p>
+      <w:pPr>
+        <w:pStyle w:val="NoSpacing"/>
+      </w:pPr>
+      <w:proofErr w:type="gramStart"/>
+      <w:r>
+        <w:t>import</w:t>
+      </w:r>
+      <w:proofErr w:type="gramEnd"/>
+      <w:r>
+        <w:t xml:space="preserve"> </w:t>
+      </w:r>
+      <w:proofErr w:type="spellStart"/>
+      <w:r>
+        <w:t>Model.User</w:t>
+      </w:r>
+      <w:proofErr w:type="spellEnd"/>
+      <w:r>
+        <w:t>;</w:t>
+      </w:r>
+    </w:p>
+    <w:p>
+      <w:pPr>
+        <w:pStyle w:val="NoSpacing"/>
+      </w:pPr>
+    </w:p>
+    <w:p>
+      <w:pPr>
+        <w:pStyle w:val="NoSpacing"/>
+      </w:pPr>
+      <w:proofErr w:type="gramStart"/>
+      <w:r>
+        <w:t>public</w:t>
+      </w:r>
+      <w:proofErr w:type="gramEnd"/>
+      <w:r>
+        <w:t xml:space="preserve"> class </w:t>
+      </w:r>
+      <w:proofErr w:type="spellStart"/>
+      <w:r>
+        <w:t>UserDAO</w:t>
+      </w:r>
+      <w:proofErr w:type="spellEnd"/>
+      <w:r>
+        <w:t xml:space="preserve"> {</w:t>
+      </w:r>
+    </w:p>
+    <w:p>
+      <w:pPr>
+        <w:pStyle w:val="NoSpacing"/>
+      </w:pPr>
+      <w:r>
+        <w:tab/>
+        <w:t>Configuration configuration=null;</w:t>
+      </w:r>
+    </w:p>
+    <w:p>
+      <w:pPr>
+        <w:pStyle w:val="NoSpacing"/>
+      </w:pPr>
+      <w:r>
+        <w:tab/>
+      </w:r>
+      <w:proofErr w:type="spellStart"/>
+      <w:r>
+        <w:t>SessionFactory</w:t>
+      </w:r>
+      <w:proofErr w:type="spellEnd"/>
+      <w:r>
+        <w:t xml:space="preserve"> </w:t>
+      </w:r>
+      <w:proofErr w:type="spellStart"/>
+      <w:r>
+        <w:t>sessionFactory</w:t>
+      </w:r>
+      <w:proofErr w:type="spellEnd"/>
+      <w:r>
+        <w:t>=null;</w:t>
+      </w:r>
+    </w:p>
+    <w:p>
+      <w:pPr>
+        <w:pStyle w:val="NoSpacing"/>
+      </w:pPr>
+      <w:r>
+        <w:tab/>
+        <w:t>Session session=null;</w:t>
+      </w:r>
+    </w:p>
+    <w:p>
+      <w:pPr>
+        <w:pStyle w:val="NoSpacing"/>
+      </w:pPr>
+      <w:r>
+        <w:tab/>
+      </w:r>
+      <w:proofErr w:type="gramStart"/>
+      <w:r>
+        <w:t>public</w:t>
+      </w:r>
+      <w:proofErr w:type="gramEnd"/>
+      <w:r>
+        <w:t xml:space="preserve"> </w:t>
+      </w:r>
+      <w:proofErr w:type="spellStart"/>
+      <w:r>
+        <w:t>UserDAO</w:t>
+      </w:r>
+      <w:proofErr w:type="spellEnd"/>
+      <w:r>
+        <w:t>() {</w:t>
+      </w:r>
+    </w:p>
+    <w:p>
+      <w:pPr>
+        <w:pStyle w:val="NoSpacing"/>
+      </w:pPr>
+      <w:r>
+        <w:tab/>
+      </w:r>
+      <w:r>
+        <w:tab/>
+        <w:t xml:space="preserve"> //1. </w:t>
+      </w:r>
+      <w:proofErr w:type="gramStart"/>
+      <w:r>
+        <w:t>create</w:t>
+      </w:r>
+      <w:proofErr w:type="gramEnd"/>
+      <w:r>
+        <w:t xml:space="preserve"> Configuration object</w:t>
+      </w:r>
+    </w:p>
+    <w:p>
+      <w:pPr>
+        <w:pStyle w:val="NoSpacing"/>
+      </w:pPr>
+      <w:r>
+        <w:tab/>
+        <w:t xml:space="preserve">     </w:t>
+      </w:r>
+      <w:proofErr w:type="gramStart"/>
+      <w:r>
+        <w:t>configuration=</w:t>
+      </w:r>
+      <w:proofErr w:type="gramEnd"/>
+      <w:r>
+        <w:t>new Configuration().configure().</w:t>
+      </w:r>
+      <w:proofErr w:type="spellStart"/>
+      <w:r>
+        <w:t>addAnnotatedClass</w:t>
+      </w:r>
+      <w:proofErr w:type="spellEnd"/>
+      <w:r>
+        <w:t>(</w:t>
+      </w:r>
+      <w:proofErr w:type="spellStart"/>
+      <w:r>
+        <w:t>User.class</w:t>
+      </w:r>
+      <w:proofErr w:type="spellEnd"/>
+      <w:r>
+        <w:t>);</w:t>
+      </w:r>
+    </w:p>
+    <w:p>
+      <w:pPr>
+        <w:pStyle w:val="NoSpacing"/>
+      </w:pPr>
+      <w:r>
+        <w:tab/>
+        <w:t xml:space="preserve">    //2. </w:t>
+      </w:r>
+      <w:proofErr w:type="gramStart"/>
+      <w:r>
+        <w:t>create</w:t>
+      </w:r>
+      <w:proofErr w:type="gramEnd"/>
+      <w:r>
+        <w:t xml:space="preserve"> Session Factory object </w:t>
+      </w:r>
+    </w:p>
+    <w:p>
+      <w:pPr>
+        <w:pStyle w:val="NoSpacing"/>
+      </w:pPr>
+      <w:r>
+        <w:tab/>
+        <w:t xml:space="preserve">     </w:t>
+      </w:r>
+      <w:proofErr w:type="spellStart"/>
+      <w:proofErr w:type="gramStart"/>
+      <w:r>
+        <w:t>sessionFactory</w:t>
+      </w:r>
+      <w:proofErr w:type="spellEnd"/>
+      <w:r>
+        <w:t>=</w:t>
+      </w:r>
+      <w:proofErr w:type="spellStart"/>
+      <w:proofErr w:type="gramEnd"/>
+      <w:r>
+        <w:t>configuration.buildSessionFactory</w:t>
+      </w:r>
+      <w:proofErr w:type="spellEnd"/>
+      <w:r>
+        <w:t>();</w:t>
+      </w:r>
+    </w:p>
+    <w:p>
+      <w:pPr>
+        <w:pStyle w:val="NoSpacing"/>
+      </w:pPr>
+      <w:r>
+        <w:tab/>
+        <w:t xml:space="preserve">    //3. Create Session object</w:t>
+      </w:r>
+    </w:p>
+    <w:p>
+      <w:pPr>
+        <w:pStyle w:val="NoSpacing"/>
+      </w:pPr>
+      <w:r>
+        <w:tab/>
+        <w:t xml:space="preserve">     </w:t>
+      </w:r>
+      <w:proofErr w:type="gramStart"/>
+      <w:r>
+        <w:t>session=</w:t>
+      </w:r>
+      <w:proofErr w:type="spellStart"/>
+      <w:proofErr w:type="gramEnd"/>
+      <w:r>
+        <w:t>sessionFactory.openSession</w:t>
+      </w:r>
+      <w:proofErr w:type="spellEnd"/>
+      <w:r>
+        <w:t>();</w:t>
+      </w:r>
+    </w:p>
+    <w:p>
+      <w:pPr>
+        <w:pStyle w:val="NoSpacing"/>
+      </w:pPr>
+      <w:r>
+        <w:tab/>
+        <w:t>}</w:t>
+      </w:r>
+    </w:p>
+    <w:p>
+      <w:pPr>
+        <w:pStyle w:val="NoSpacing"/>
+      </w:pPr>
+      <w:r>
+        <w:tab/>
+      </w:r>
+      <w:proofErr w:type="gramStart"/>
+      <w:r>
+        <w:t>public</w:t>
+      </w:r>
+      <w:proofErr w:type="gramEnd"/>
+      <w:r>
+        <w:t xml:space="preserve"> void </w:t>
+      </w:r>
+      <w:proofErr w:type="spellStart"/>
+      <w:r>
+        <w:t>saveUser</w:t>
+      </w:r>
+      <w:proofErr w:type="spellEnd"/>
+      <w:r>
+        <w:t>(User user) {</w:t>
+      </w:r>
+    </w:p>
+    <w:p>
+      <w:pPr>
+        <w:pStyle w:val="NoSpacing"/>
+      </w:pPr>
+      <w:r>
+        <w:t xml:space="preserve"> </w:t>
+      </w:r>
+      <w:r>
+        <w:tab/>
+        <w:t xml:space="preserve">     //4. Begin your transaction</w:t>
+      </w:r>
+    </w:p>
+    <w:p>
+      <w:pPr>
+        <w:pStyle w:val="NoSpacing"/>
+      </w:pPr>
+      <w:r>
+        <w:t xml:space="preserve">    Transaction transaction=</w:t>
+      </w:r>
+      <w:proofErr w:type="spellStart"/>
+      <w:proofErr w:type="gramStart"/>
+      <w:r>
+        <w:t>session.beginTransaction</w:t>
+      </w:r>
+      <w:proofErr w:type="spellEnd"/>
+      <w:r>
+        <w:t>(</w:t>
+      </w:r>
+      <w:proofErr w:type="gramEnd"/>
+      <w:r>
+        <w:t>);</w:t>
+      </w:r>
+    </w:p>
+    <w:p>
+      <w:pPr>
+        <w:pStyle w:val="NoSpacing"/>
+      </w:pPr>
+      <w:r>
+        <w:t xml:space="preserve">    //5.Save your object to database</w:t>
+      </w:r>
+    </w:p>
+    <w:p>
+      <w:pPr>
+        <w:pStyle w:val="NoSpacing"/>
+      </w:pPr>
+      <w:r>
+        <w:t xml:space="preserve">    </w:t>
+      </w:r>
+      <w:proofErr w:type="spellStart"/>
+      <w:proofErr w:type="gramStart"/>
+      <w:r>
+        <w:t>session.save</w:t>
+      </w:r>
+      <w:proofErr w:type="spellEnd"/>
+      <w:r>
+        <w:t>(</w:t>
+      </w:r>
+      <w:proofErr w:type="gramEnd"/>
+      <w:r>
+        <w:t xml:space="preserve">user);    </w:t>
+      </w:r>
+    </w:p>
+    <w:p>
+      <w:pPr>
+        <w:pStyle w:val="NoSpacing"/>
+      </w:pPr>
+      <w:r>
+        <w:t xml:space="preserve">    </w:t>
+      </w:r>
+      <w:proofErr w:type="spellStart"/>
+      <w:proofErr w:type="gramStart"/>
+      <w:r>
+        <w:t>System.out.println</w:t>
+      </w:r>
+      <w:proofErr w:type="spellEnd"/>
+      <w:r>
+        <w:t>(</w:t>
+      </w:r>
+      <w:proofErr w:type="gramEnd"/>
+      <w:r>
+        <w:t>"Saved");</w:t>
+      </w:r>
+    </w:p>
+    <w:p>
+      <w:pPr>
+        <w:pStyle w:val="NoSpacing"/>
+      </w:pPr>
+      <w:r>
+        <w:lastRenderedPageBreak/>
+        <w:t xml:space="preserve">    //6. Commit your transaction </w:t>
+      </w:r>
+    </w:p>
+    <w:p>
+      <w:pPr>
+        <w:pStyle w:val="NoSpacing"/>
+      </w:pPr>
+      <w:r>
+        <w:t xml:space="preserve">    </w:t>
+      </w:r>
+      <w:proofErr w:type="spellStart"/>
+      <w:proofErr w:type="gramStart"/>
+      <w:r>
+        <w:t>transaction.commit</w:t>
+      </w:r>
+      <w:proofErr w:type="spellEnd"/>
+      <w:r>
+        <w:t>(</w:t>
+      </w:r>
+      <w:proofErr w:type="gramEnd"/>
+      <w:r>
+        <w:t>);</w:t>
+      </w:r>
+    </w:p>
+    <w:p>
+      <w:pPr>
+        <w:pStyle w:val="NoSpacing"/>
+      </w:pPr>
+      <w:r>
+        <w:t xml:space="preserve">    </w:t>
+      </w:r>
+      <w:proofErr w:type="spellStart"/>
+      <w:proofErr w:type="gramStart"/>
+      <w:r>
+        <w:t>session.close</w:t>
+      </w:r>
+      <w:proofErr w:type="spellEnd"/>
+      <w:r>
+        <w:t>(</w:t>
+      </w:r>
+      <w:proofErr w:type="gramEnd"/>
+      <w:r>
+        <w:t>);</w:t>
+      </w:r>
+    </w:p>
+    <w:p>
+      <w:pPr>
+        <w:pStyle w:val="NoSpacing"/>
+      </w:pPr>
+      <w:r>
+        <w:t xml:space="preserve">    </w:t>
+      </w:r>
+      <w:proofErr w:type="spellStart"/>
+      <w:proofErr w:type="gramStart"/>
+      <w:r>
+        <w:t>sessionFactory.close</w:t>
+      </w:r>
+      <w:proofErr w:type="spellEnd"/>
+      <w:r>
+        <w:t>(</w:t>
+      </w:r>
+      <w:proofErr w:type="gramEnd"/>
+      <w:r>
+        <w:t>);</w:t>
+      </w:r>
+    </w:p>
+    <w:p>
+      <w:pPr>
+        <w:pStyle w:val="NoSpacing"/>
+      </w:pPr>
+      <w:r>
+        <w:tab/>
+        <w:t>}</w:t>
+      </w:r>
+    </w:p>
+    <w:p>
+      <w:pPr>
+        <w:pStyle w:val="NoSpacing"/>
+      </w:pPr>
+      <w:r>
+        <w:t>}</w:t>
+      </w:r>
+    </w:p>
+    <w:p>
+      <w:pPr>
+        <w:pStyle w:val="NoSpacing"/>
+      </w:pPr>
+      <w:r>
+        <w:tab/>
+      </w:r>
+    </w:p>
+    <w:p>
+      <w:pPr>
+        <w:rPr>
+          <w:b/>
           <w:sz w:val="28"/>
           <w:szCs w:val="28"/>
         </w:rPr>
@@ -10811,55 +10811,6 @@
           <w:szCs w:val="28"/>
         </w:rPr>
       </w:pPr>
-      <w:r>
-        <w:rPr>
-          <w:rFonts w:ascii="Consolas" w:hAnsi="Consolas"/>
-          <w:color w:val="008080"/>
-          <w:sz w:val="28"/>
-          <w:szCs w:val="28"/>
-        </w:rPr>
-        <w:t xml:space="preserve">Hibernate.cfg.xml must be created under </w:t>
-      </w:r>
-      <w:proofErr w:type="spellStart"/>
-      <w:r>
-        <w:rPr>
-          <w:rFonts w:ascii="Consolas" w:hAnsi="Consolas"/>
-          <w:color w:val="008080"/>
-          <w:sz w:val="28"/>
-          <w:szCs w:val="28"/>
-        </w:rPr>
-        <w:t>src</w:t>
-      </w:r>
-      <w:proofErr w:type="spellEnd"/>
-      <w:r>
-        <w:rPr>
-          <w:rFonts w:ascii="Consolas" w:hAnsi="Consolas"/>
-          <w:color w:val="008080"/>
-          <w:sz w:val="28"/>
-          <w:szCs w:val="28"/>
-        </w:rPr>
-        <w:t xml:space="preserve">/main/java by </w:t>
-      </w:r>
-      <w:proofErr w:type="spellStart"/>
-      <w:r>
-        <w:rPr>
-          <w:rFonts w:ascii="Consolas" w:hAnsi="Consolas"/>
-          <w:color w:val="008080"/>
-          <w:sz w:val="28"/>
-          <w:szCs w:val="28"/>
-        </w:rPr>
-        <w:t>rightclick</w:t>
-      </w:r>
-      <w:proofErr w:type="spellEnd"/>
-      <w:r>
-        <w:rPr>
-          <w:rFonts w:ascii="Consolas" w:hAnsi="Consolas"/>
-          <w:color w:val="008080"/>
-          <w:sz w:val="28"/>
-          <w:szCs w:val="28"/>
-        </w:rPr>
-        <w:t xml:space="preserve">-&gt; file </w:t>
-      </w:r>
     </w:p>
     <w:p>
       <w:pPr>
@@ -10873,6 +10824,55 @@
           <w:szCs w:val="28"/>
         </w:rPr>
       </w:pPr>
+      <w:r>
+        <w:rPr>
+          <w:rFonts w:ascii="Consolas" w:hAnsi="Consolas"/>
+          <w:color w:val="008080"/>
+          <w:sz w:val="28"/>
+          <w:szCs w:val="28"/>
+        </w:rPr>
+        <w:t xml:space="preserve">Hibernate.cfg.xml must be created under </w:t>
+      </w:r>
+      <w:proofErr w:type="spellStart"/>
+      <w:r>
+        <w:rPr>
+          <w:rFonts w:ascii="Consolas" w:hAnsi="Consolas"/>
+          <w:color w:val="008080"/>
+          <w:sz w:val="28"/>
+          <w:szCs w:val="28"/>
+        </w:rPr>
+        <w:t>src</w:t>
+      </w:r>
+      <w:proofErr w:type="spellEnd"/>
+      <w:r>
+        <w:rPr>
+          <w:rFonts w:ascii="Consolas" w:hAnsi="Consolas"/>
+          <w:color w:val="008080"/>
+          <w:sz w:val="28"/>
+          <w:szCs w:val="28"/>
+        </w:rPr>
+        <w:t xml:space="preserve">/main/java by </w:t>
+      </w:r>
+      <w:proofErr w:type="spellStart"/>
+      <w:r>
+        <w:rPr>
+          <w:rFonts w:ascii="Consolas" w:hAnsi="Consolas"/>
+          <w:color w:val="008080"/>
+          <w:sz w:val="28"/>
+          <w:szCs w:val="28"/>
+        </w:rPr>
+        <w:t>rightclick</w:t>
+      </w:r>
+      <w:proofErr w:type="spellEnd"/>
+      <w:r>
+        <w:rPr>
+          <w:rFonts w:ascii="Consolas" w:hAnsi="Consolas"/>
+          <w:color w:val="008080"/>
+          <w:sz w:val="28"/>
+          <w:szCs w:val="28"/>
+        </w:rPr>
+        <w:t xml:space="preserve">-&gt; file </w:t>
+      </w:r>
     </w:p>
     <w:p>
       <w:pPr>
@@ -10881,24 +10881,11 @@
         <w:spacing w:before="0" w:beforeAutospacing="0" w:after="0" w:afterAutospacing="0"/>
         <w:rPr>
           <w:rFonts w:ascii="Consolas" w:hAnsi="Consolas"/>
-          <w:b/>
-          <w:color w:val="008080"/>
-          <w:sz w:val="28"/>
-          <w:szCs w:val="28"/>
-          <w:u w:val="single"/>
-        </w:rPr>
-      </w:pPr>
-      <w:r>
-        <w:rPr>
-          <w:rFonts w:ascii="Consolas" w:hAnsi="Consolas"/>
-          <w:b/>
-          <w:color w:val="008080"/>
-          <w:sz w:val="28"/>
-          <w:szCs w:val="28"/>
-          <w:u w:val="single"/>
-        </w:rPr>
-        <w:t>Hibernate.cfg.xml</w:t>
-      </w:r>
+          <w:color w:val="008080"/>
+          <w:sz w:val="28"/>
+          <w:szCs w:val="28"/>
+        </w:rPr>
+      </w:pPr>
     </w:p>
     <w:p>
       <w:pPr>
@@ -10914,6 +10901,17 @@
           <w:u w:val="single"/>
         </w:rPr>
       </w:pPr>
+      <w:r>
+        <w:rPr>
+          <w:rFonts w:ascii="Consolas" w:hAnsi="Consolas"/>
+          <w:b/>
+          <w:color w:val="008080"/>
+          <w:sz w:val="28"/>
+          <w:szCs w:val="28"/>
+          <w:u w:val="single"/>
+        </w:rPr>
+        <w:t>Hibernate.cfg.xml</w:t>
+      </w:r>
     </w:p>
     <w:p>
       <w:pPr>
@@ -10922,6 +10920,21 @@
         <w:spacing w:before="0" w:beforeAutospacing="0" w:after="0" w:afterAutospacing="0"/>
         <w:rPr>
           <w:rFonts w:ascii="Consolas" w:hAnsi="Consolas"/>
+          <w:b/>
+          <w:color w:val="008080"/>
+          <w:sz w:val="28"/>
+          <w:szCs w:val="28"/>
+          <w:u w:val="single"/>
+        </w:rPr>
+      </w:pPr>
+    </w:p>
+    <w:p>
+      <w:pPr>
+        <w:pStyle w:val="NormalWeb"/>
+        <w:shd w:val="clear" w:color="auto" w:fill="FFFFFF"/>
+        <w:spacing w:before="0" w:beforeAutospacing="0" w:after="0" w:afterAutospacing="0"/>
+        <w:rPr>
+          <w:rFonts w:ascii="Consolas" w:hAnsi="Consolas"/>
           <w:color w:val="000000"/>
           <w:sz w:val="28"/>
           <w:szCs w:val="28"/>
@@ -12511,6 +12524,7 @@
           <w:sz w:val="28"/>
           <w:szCs w:val="28"/>
         </w:rPr>
+        <w:lastRenderedPageBreak/>
         <w:t>&lt;!</w:t>
       </w:r>
       <w:r>
@@ -12610,7 +12624,6 @@
           <w:sz w:val="28"/>
           <w:szCs w:val="28"/>
         </w:rPr>
-        <w:lastRenderedPageBreak/>
         <w:t xml:space="preserve"> </w:t>
       </w:r>
       <w:r>
@@ -14323,7 +14336,7 @@
 </file>
 
 <file path=customXml/itemProps1.xml><?xml version="1.0" encoding="utf-8"?>
-<ds:datastoreItem xmlns:ds="http://schemas.openxmlformats.org/officeDocument/2006/customXml" ds:itemID="{EFDF3065-F849-4896-BC22-2BF0C28B01C5}">
+<ds:datastoreItem xmlns:ds="http://schemas.openxmlformats.org/officeDocument/2006/customXml" ds:itemID="{C5B5D9D3-CFCF-492F-84D8-AEF538D23F48}">
   <ds:schemaRefs>
     <ds:schemaRef ds:uri="http://schemas.openxmlformats.org/officeDocument/2006/bibliography"/>
   </ds:schemaRefs>

</xml_diff>